<commit_message>
Ajout d'exercices sur les composants d'un ordinateur.
</commit_message>
<xml_diff>
--- a/docs/1re/architecture/labo-corrige.docx
+++ b/docs/1re/architecture/labo-corrige.docx
@@ -202,21 +202,7 @@
           <w:b/>
           <w:bCs/>
         </w:rPr>
-        <w:t>Compléte</w:t>
-      </w:r>
-      <w:r>
-        <w:rPr>
-          <w:b/>
-          <w:bCs/>
-        </w:rPr>
-        <w:t>z</w:t>
-      </w:r>
-      <w:r>
-        <w:rPr>
-          <w:b/>
-          <w:bCs/>
-        </w:rPr>
-        <w:t xml:space="preserve"> le tableau ci-dessous avec les différents périphériques possibles.</w:t>
+        <w:t>Complétez le tableau ci-dessous avec les différents périphériques possibles.</w:t>
       </w:r>
     </w:p>
     <w:tbl>
@@ -232,24 +218,25 @@
           <w:bottom w:w="0" w:type="dxa"/>
           <w:end w:w="108" w:type="dxa"/>
         </w:tblCellMar>
-        <w:tblLook w:firstRow="1" w:noVBand="1" w:lastRow="0" w:firstColumn="1" w:lastColumn="0" w:noHBand="0" w:val="04a0"/>
+        <w:tblLook w:val="04a0" w:firstRow="1" w:noVBand="1" w:lastRow="0" w:firstColumn="1" w:lastColumn="0" w:noHBand="0"/>
       </w:tblPr>
       <w:tblGrid>
-        <w:gridCol w:w="2688"/>
-        <w:gridCol w:w="2268"/>
+        <w:gridCol w:w="2687"/>
+        <w:gridCol w:w="2269"/>
         <w:gridCol w:w="4060"/>
       </w:tblGrid>
       <w:tr>
         <w:trPr/>
         <w:tc>
           <w:tcPr>
-            <w:tcW w:w="2688" w:type="dxa"/>
+            <w:tcW w:w="2687" w:type="dxa"/>
             <w:tcBorders/>
           </w:tcPr>
           <w:p>
             <w:pPr>
               <w:pStyle w:val="Normal"/>
               <w:widowControl/>
+              <w:suppressAutoHyphens w:val="true"/>
               <w:spacing w:lineRule="auto" w:line="240" w:before="0" w:after="0"/>
               <w:jc w:val="start"/>
               <w:rPr>
@@ -273,13 +260,14 @@
         </w:tc>
         <w:tc>
           <w:tcPr>
-            <w:tcW w:w="2268" w:type="dxa"/>
+            <w:tcW w:w="2269" w:type="dxa"/>
             <w:tcBorders/>
           </w:tcPr>
           <w:p>
             <w:pPr>
               <w:pStyle w:val="Normal"/>
               <w:widowControl/>
+              <w:suppressAutoHyphens w:val="true"/>
               <w:spacing w:lineRule="auto" w:line="240" w:before="0" w:after="0"/>
               <w:jc w:val="center"/>
               <w:rPr>
@@ -311,6 +299,7 @@
             <w:pPr>
               <w:pStyle w:val="Normal"/>
               <w:widowControl/>
+              <w:suppressAutoHyphens w:val="true"/>
               <w:spacing w:lineRule="auto" w:line="240" w:before="0" w:after="0"/>
               <w:jc w:val="center"/>
               <w:rPr>
@@ -338,13 +327,14 @@
         <w:trPr/>
         <w:tc>
           <w:tcPr>
-            <w:tcW w:w="2688" w:type="dxa"/>
+            <w:tcW w:w="2687" w:type="dxa"/>
             <w:tcBorders/>
           </w:tcPr>
           <w:p>
             <w:pPr>
               <w:pStyle w:val="Normal"/>
               <w:widowControl/>
+              <w:suppressAutoHyphens w:val="true"/>
               <w:spacing w:lineRule="auto" w:line="240" w:before="0" w:after="0"/>
               <w:jc w:val="start"/>
               <w:rPr>
@@ -369,13 +359,14 @@
         </w:tc>
         <w:tc>
           <w:tcPr>
-            <w:tcW w:w="2268" w:type="dxa"/>
+            <w:tcW w:w="2269" w:type="dxa"/>
             <w:tcBorders/>
           </w:tcPr>
           <w:p>
             <w:pPr>
               <w:pStyle w:val="Normal"/>
               <w:widowControl/>
+              <w:suppressAutoHyphens w:val="true"/>
               <w:spacing w:lineRule="auto" w:line="240" w:before="0" w:after="0"/>
               <w:jc w:val="start"/>
               <w:rPr>
@@ -405,6 +396,7 @@
                 <w:ilvl w:val="0"/>
                 <w:numId w:val="3"/>
               </w:numPr>
+              <w:suppressAutoHyphens w:val="true"/>
               <w:spacing w:lineRule="auto" w:line="240" w:before="0" w:after="0"/>
               <w:contextualSpacing/>
               <w:jc w:val="start"/>
@@ -435,6 +427,7 @@
                 <w:ilvl w:val="0"/>
                 <w:numId w:val="3"/>
               </w:numPr>
+              <w:suppressAutoHyphens w:val="true"/>
               <w:spacing w:lineRule="auto" w:line="240" w:before="0" w:after="0"/>
               <w:contextualSpacing/>
               <w:jc w:val="start"/>
@@ -465,6 +458,7 @@
                 <w:ilvl w:val="0"/>
                 <w:numId w:val="3"/>
               </w:numPr>
+              <w:suppressAutoHyphens w:val="true"/>
               <w:spacing w:lineRule="auto" w:line="240" w:before="0" w:after="0"/>
               <w:contextualSpacing/>
               <w:jc w:val="start"/>
@@ -495,6 +489,7 @@
                 <w:ilvl w:val="0"/>
                 <w:numId w:val="3"/>
               </w:numPr>
+              <w:suppressAutoHyphens w:val="true"/>
               <w:spacing w:lineRule="auto" w:line="240" w:before="0" w:after="0"/>
               <w:contextualSpacing/>
               <w:jc w:val="start"/>
@@ -525,6 +520,7 @@
                 <w:ilvl w:val="0"/>
                 <w:numId w:val="3"/>
               </w:numPr>
+              <w:suppressAutoHyphens w:val="true"/>
               <w:spacing w:lineRule="auto" w:line="240" w:before="0" w:after="0"/>
               <w:contextualSpacing/>
               <w:jc w:val="start"/>
@@ -557,6 +553,7 @@
             <w:pPr>
               <w:pStyle w:val="Normal"/>
               <w:widowControl/>
+              <w:suppressAutoHyphens w:val="true"/>
               <w:spacing w:lineRule="auto" w:line="240" w:before="0" w:after="0"/>
               <w:jc w:val="start"/>
               <w:rPr>
@@ -579,6 +576,7 @@
             <w:pPr>
               <w:pStyle w:val="Normal"/>
               <w:widowControl/>
+              <w:suppressAutoHyphens w:val="true"/>
               <w:spacing w:lineRule="auto" w:line="240" w:before="0" w:after="0"/>
               <w:jc w:val="start"/>
               <w:rPr>
@@ -603,6 +601,7 @@
             <w:pPr>
               <w:pStyle w:val="Normal"/>
               <w:widowControl/>
+              <w:suppressAutoHyphens w:val="true"/>
               <w:spacing w:lineRule="auto" w:line="240" w:before="0" w:after="0"/>
               <w:jc w:val="start"/>
               <w:rPr>
@@ -627,6 +626,7 @@
             <w:pPr>
               <w:pStyle w:val="Normal"/>
               <w:widowControl/>
+              <w:suppressAutoHyphens w:val="true"/>
               <w:spacing w:lineRule="auto" w:line="240" w:before="0" w:after="0"/>
               <w:jc w:val="start"/>
               <w:rPr>
@@ -651,6 +651,7 @@
             <w:pPr>
               <w:pStyle w:val="Normal"/>
               <w:widowControl/>
+              <w:suppressAutoHyphens w:val="true"/>
               <w:spacing w:lineRule="auto" w:line="240" w:before="0" w:after="0"/>
               <w:jc w:val="start"/>
               <w:rPr>
@@ -677,13 +678,14 @@
         <w:trPr/>
         <w:tc>
           <w:tcPr>
-            <w:tcW w:w="2688" w:type="dxa"/>
+            <w:tcW w:w="2687" w:type="dxa"/>
             <w:tcBorders/>
           </w:tcPr>
           <w:p>
             <w:pPr>
               <w:pStyle w:val="Normal"/>
               <w:widowControl/>
+              <w:suppressAutoHyphens w:val="true"/>
               <w:spacing w:lineRule="auto" w:line="240" w:before="0" w:after="0"/>
               <w:jc w:val="start"/>
               <w:rPr>
@@ -708,13 +710,14 @@
         </w:tc>
         <w:tc>
           <w:tcPr>
-            <w:tcW w:w="2268" w:type="dxa"/>
+            <w:tcW w:w="2269" w:type="dxa"/>
             <w:tcBorders/>
           </w:tcPr>
           <w:p>
             <w:pPr>
               <w:pStyle w:val="Normal"/>
               <w:widowControl/>
+              <w:suppressAutoHyphens w:val="true"/>
               <w:spacing w:lineRule="auto" w:line="240" w:before="0" w:after="0"/>
               <w:jc w:val="start"/>
               <w:rPr>
@@ -746,6 +749,7 @@
             <w:pPr>
               <w:pStyle w:val="Normal"/>
               <w:widowControl/>
+              <w:suppressAutoHyphens w:val="true"/>
               <w:spacing w:lineRule="auto" w:line="240" w:before="0" w:after="0"/>
               <w:jc w:val="start"/>
               <w:rPr>
@@ -774,13 +778,14 @@
         <w:trPr/>
         <w:tc>
           <w:tcPr>
-            <w:tcW w:w="2688" w:type="dxa"/>
+            <w:tcW w:w="2687" w:type="dxa"/>
             <w:tcBorders/>
           </w:tcPr>
           <w:p>
             <w:pPr>
               <w:pStyle w:val="Normal"/>
               <w:widowControl/>
+              <w:suppressAutoHyphens w:val="true"/>
               <w:spacing w:lineRule="auto" w:line="240" w:before="0" w:after="0"/>
               <w:jc w:val="start"/>
               <w:rPr>
@@ -805,13 +810,14 @@
         </w:tc>
         <w:tc>
           <w:tcPr>
-            <w:tcW w:w="2268" w:type="dxa"/>
+            <w:tcW w:w="2269" w:type="dxa"/>
             <w:tcBorders/>
           </w:tcPr>
           <w:p>
             <w:pPr>
               <w:pStyle w:val="Normal"/>
               <w:widowControl/>
+              <w:suppressAutoHyphens w:val="true"/>
               <w:spacing w:lineRule="auto" w:line="240" w:before="0" w:after="0"/>
               <w:jc w:val="start"/>
               <w:rPr>
@@ -837,6 +843,7 @@
             <w:pPr>
               <w:pStyle w:val="Normal"/>
               <w:widowControl/>
+              <w:suppressAutoHyphens w:val="true"/>
               <w:spacing w:lineRule="auto" w:line="240" w:before="0" w:after="0"/>
               <w:jc w:val="start"/>
               <w:rPr>
@@ -861,6 +868,7 @@
             <w:pPr>
               <w:pStyle w:val="Normal"/>
               <w:widowControl/>
+              <w:suppressAutoHyphens w:val="true"/>
               <w:spacing w:lineRule="auto" w:line="240" w:before="0" w:after="0"/>
               <w:jc w:val="start"/>
               <w:rPr>
@@ -885,6 +893,7 @@
             <w:pPr>
               <w:pStyle w:val="Normal"/>
               <w:widowControl/>
+              <w:suppressAutoHyphens w:val="true"/>
               <w:spacing w:lineRule="auto" w:line="240" w:before="0" w:after="0"/>
               <w:jc w:val="start"/>
               <w:rPr>
@@ -909,6 +918,7 @@
             <w:pPr>
               <w:pStyle w:val="Normal"/>
               <w:widowControl/>
+              <w:suppressAutoHyphens w:val="true"/>
               <w:spacing w:lineRule="auto" w:line="240" w:before="0" w:after="0"/>
               <w:jc w:val="start"/>
               <w:rPr>
@@ -933,6 +943,7 @@
             <w:pPr>
               <w:pStyle w:val="Normal"/>
               <w:widowControl/>
+              <w:suppressAutoHyphens w:val="true"/>
               <w:spacing w:lineRule="auto" w:line="240" w:before="0" w:after="0"/>
               <w:jc w:val="start"/>
               <w:rPr>
@@ -963,6 +974,7 @@
             <w:pPr>
               <w:pStyle w:val="Normal"/>
               <w:widowControl/>
+              <w:suppressAutoHyphens w:val="true"/>
               <w:spacing w:lineRule="auto" w:line="240" w:before="0" w:after="0"/>
               <w:jc w:val="start"/>
               <w:rPr>
@@ -985,6 +997,7 @@
             <w:pPr>
               <w:pStyle w:val="Normal"/>
               <w:widowControl/>
+              <w:suppressAutoHyphens w:val="true"/>
               <w:spacing w:lineRule="auto" w:line="240" w:before="0" w:after="0"/>
               <w:jc w:val="start"/>
               <w:rPr>
@@ -1009,6 +1022,7 @@
             <w:pPr>
               <w:pStyle w:val="Normal"/>
               <w:widowControl/>
+              <w:suppressAutoHyphens w:val="true"/>
               <w:spacing w:lineRule="auto" w:line="240" w:before="0" w:after="0"/>
               <w:jc w:val="start"/>
               <w:rPr>
@@ -1033,6 +1047,7 @@
             <w:pPr>
               <w:pStyle w:val="Normal"/>
               <w:widowControl/>
+              <w:suppressAutoHyphens w:val="true"/>
               <w:spacing w:lineRule="auto" w:line="240" w:before="0" w:after="0"/>
               <w:jc w:val="start"/>
               <w:rPr>
@@ -1057,6 +1072,7 @@
             <w:pPr>
               <w:pStyle w:val="Normal"/>
               <w:widowControl/>
+              <w:suppressAutoHyphens w:val="true"/>
               <w:spacing w:lineRule="auto" w:line="240" w:before="0" w:after="0"/>
               <w:jc w:val="start"/>
               <w:rPr>
@@ -1081,6 +1097,7 @@
             <w:pPr>
               <w:pStyle w:val="Normal"/>
               <w:widowControl/>
+              <w:suppressAutoHyphens w:val="true"/>
               <w:spacing w:lineRule="auto" w:line="240" w:before="0" w:after="0"/>
               <w:jc w:val="start"/>
               <w:rPr>
@@ -1105,6 +1122,7 @@
             <w:pPr>
               <w:pStyle w:val="Normal"/>
               <w:widowControl/>
+              <w:suppressAutoHyphens w:val="true"/>
               <w:spacing w:lineRule="auto" w:line="240" w:before="0" w:after="0"/>
               <w:jc w:val="start"/>
               <w:rPr>
@@ -1129,6 +1147,7 @@
             <w:pPr>
               <w:pStyle w:val="Normal"/>
               <w:widowControl/>
+              <w:suppressAutoHyphens w:val="true"/>
               <w:spacing w:lineRule="auto" w:line="240" w:before="0" w:after="0"/>
               <w:jc w:val="start"/>
               <w:rPr>
@@ -1153,6 +1172,7 @@
             <w:pPr>
               <w:pStyle w:val="Normal"/>
               <w:widowControl/>
+              <w:suppressAutoHyphens w:val="true"/>
               <w:spacing w:lineRule="auto" w:line="240" w:before="0" w:after="0"/>
               <w:jc w:val="start"/>
               <w:rPr>
@@ -1226,15 +1246,7 @@
       </w:pPr>
       <w:r>
         <w:rPr/>
-        <w:t>Recherche</w:t>
-      </w:r>
-      <w:r>
-        <w:rPr/>
-        <w:t>z</w:t>
-      </w:r>
-      <w:r>
-        <w:rPr/>
-        <w:t xml:space="preserve"> une</w:t>
+        <w:t>Recherchez une</w:t>
       </w:r>
       <w:r>
         <w:rPr>
@@ -1272,7 +1284,7 @@
           <w:bottom w:w="0" w:type="dxa"/>
           <w:end w:w="108" w:type="dxa"/>
         </w:tblCellMar>
-        <w:tblLook w:firstRow="1" w:noVBand="1" w:lastRow="0" w:firstColumn="1" w:lastColumn="0" w:noHBand="0" w:val="04a0"/>
+        <w:tblLook w:val="04a0" w:firstRow="1" w:noVBand="1" w:lastRow="0" w:firstColumn="1" w:lastColumn="0" w:noHBand="0"/>
       </w:tblPr>
       <w:tblGrid>
         <w:gridCol w:w="9016"/>
@@ -1288,6 +1300,7 @@
             <w:pPr>
               <w:pStyle w:val="Normal"/>
               <w:widowControl/>
+              <w:suppressAutoHyphens w:val="true"/>
               <w:spacing w:lineRule="auto" w:line="240" w:before="0" w:after="0"/>
               <w:jc w:val="start"/>
               <w:rPr>
@@ -1321,6 +1334,7 @@
             <w:pPr>
               <w:pStyle w:val="Normal"/>
               <w:widowControl/>
+              <w:suppressAutoHyphens w:val="true"/>
               <w:spacing w:lineRule="auto" w:line="240" w:before="0" w:after="0"/>
               <w:jc w:val="start"/>
               <w:rPr>
@@ -1343,6 +1357,7 @@
             <w:pPr>
               <w:pStyle w:val="Normal"/>
               <w:widowControl/>
+              <w:suppressAutoHyphens w:val="true"/>
               <w:spacing w:lineRule="auto" w:line="240" w:before="0" w:after="0"/>
               <w:jc w:val="start"/>
               <w:rPr>
@@ -1375,6 +1390,7 @@
             <w:pPr>
               <w:pStyle w:val="Normal"/>
               <w:widowControl/>
+              <w:suppressAutoHyphens w:val="true"/>
               <w:spacing w:lineRule="auto" w:line="240" w:before="0" w:after="0"/>
               <w:jc w:val="start"/>
               <w:rPr>
@@ -1383,13 +1399,7 @@
               </w:rPr>
             </w:pPr>
             <w:r>
-              <w:rPr>
-                <w:rFonts w:eastAsia="Calibri" w:cs="Arial"/>
-                <w:kern w:val="0"/>
-                <w:sz w:val="22"/>
-                <w:szCs w:val="22"/>
-                <w:lang w:val="fr-CH" w:eastAsia="en-US" w:bidi="ar-SA"/>
-              </w:rPr>
+              <w:rPr/>
               <w:drawing>
                 <wp:inline distT="0" distB="0" distL="0" distR="0">
                   <wp:extent cx="5103495" cy="4229100"/>
@@ -1434,6 +1444,7 @@
             <w:pPr>
               <w:pStyle w:val="Normal"/>
               <w:widowControl/>
+              <w:suppressAutoHyphens w:val="true"/>
               <w:spacing w:lineRule="auto" w:line="240" w:before="0" w:after="0"/>
               <w:jc w:val="start"/>
               <w:rPr>
@@ -1443,20 +1454,16 @@
             </w:pPr>
             <w:r>
               <w:rPr>
-                <w:rFonts w:eastAsia="Calibri" w:cs="Arial"/>
                 <w:b/>
                 <w:bCs/>
-                <w:kern w:val="0"/>
-                <w:sz w:val="22"/>
-                <w:szCs w:val="22"/>
-                <w:lang w:val="fr-CH" w:eastAsia="en-US" w:bidi="ar-SA"/>
-              </w:rPr>
-            </w:r>
-          </w:p>
-          <w:p>
-            <w:pPr>
-              <w:pStyle w:val="Normal"/>
-              <w:widowControl/>
+              </w:rPr>
+            </w:r>
+          </w:p>
+          <w:p>
+            <w:pPr>
+              <w:pStyle w:val="Normal"/>
+              <w:widowControl/>
+              <w:suppressAutoHyphens w:val="true"/>
               <w:spacing w:lineRule="auto" w:line="240" w:before="0" w:after="0"/>
               <w:jc w:val="start"/>
               <w:rPr>
@@ -1466,13 +1473,8 @@
             </w:pPr>
             <w:r>
               <w:rPr>
-                <w:rFonts w:eastAsia="Calibri" w:cs="Arial"/>
                 <w:b/>
                 <w:bCs/>
-                <w:kern w:val="0"/>
-                <w:sz w:val="22"/>
-                <w:szCs w:val="22"/>
-                <w:lang w:val="fr-CH" w:eastAsia="en-US" w:bidi="ar-SA"/>
               </w:rPr>
             </w:r>
           </w:p>
@@ -1489,6 +1491,7 @@
             <w:pPr>
               <w:pStyle w:val="Normal"/>
               <w:widowControl/>
+              <w:suppressAutoHyphens w:val="true"/>
               <w:spacing w:lineRule="auto" w:line="240" w:before="0" w:after="0"/>
               <w:jc w:val="start"/>
               <w:rPr>
@@ -1514,6 +1517,7 @@
             <w:pPr>
               <w:pStyle w:val="Normal"/>
               <w:widowControl/>
+              <w:suppressAutoHyphens w:val="true"/>
               <w:spacing w:lineRule="auto" w:line="240" w:before="0" w:after="0"/>
               <w:jc w:val="start"/>
               <w:rPr>
@@ -1549,6 +1553,7 @@
             <w:pPr>
               <w:pStyle w:val="Normal"/>
               <w:widowControl/>
+              <w:suppressAutoHyphens w:val="true"/>
               <w:spacing w:lineRule="auto" w:line="240" w:before="0" w:after="0"/>
               <w:jc w:val="start"/>
               <w:rPr>
@@ -1557,13 +1562,7 @@
               </w:rPr>
             </w:pPr>
             <w:r>
-              <w:rPr>
-                <w:rFonts w:eastAsia="Calibri" w:cs="Arial"/>
-                <w:kern w:val="0"/>
-                <w:sz w:val="22"/>
-                <w:szCs w:val="22"/>
-                <w:lang w:val="fr-CH" w:eastAsia="en-US" w:bidi="ar-SA"/>
-              </w:rPr>
+              <w:rPr/>
               <w:drawing>
                 <wp:inline distT="0" distB="0" distL="0" distR="0">
                   <wp:extent cx="1813560" cy="1883410"/>
@@ -1608,6 +1607,7 @@
             <w:pPr>
               <w:pStyle w:val="Normal"/>
               <w:widowControl/>
+              <w:suppressAutoHyphens w:val="true"/>
               <w:spacing w:lineRule="auto" w:line="240" w:before="0" w:after="0"/>
               <w:jc w:val="start"/>
               <w:rPr>
@@ -1617,20 +1617,16 @@
             </w:pPr>
             <w:r>
               <w:rPr>
-                <w:rFonts w:eastAsia="Calibri" w:cs="Arial"/>
                 <w:b/>
                 <w:bCs/>
-                <w:kern w:val="0"/>
-                <w:sz w:val="22"/>
-                <w:szCs w:val="22"/>
-                <w:lang w:val="fr-CH" w:eastAsia="en-US" w:bidi="ar-SA"/>
-              </w:rPr>
-            </w:r>
-          </w:p>
-          <w:p>
-            <w:pPr>
-              <w:pStyle w:val="Normal"/>
-              <w:widowControl/>
+              </w:rPr>
+            </w:r>
+          </w:p>
+          <w:p>
+            <w:pPr>
+              <w:pStyle w:val="Normal"/>
+              <w:widowControl/>
+              <w:suppressAutoHyphens w:val="true"/>
               <w:spacing w:lineRule="auto" w:line="240" w:before="0" w:after="0"/>
               <w:jc w:val="start"/>
               <w:rPr>
@@ -1640,13 +1636,8 @@
             </w:pPr>
             <w:r>
               <w:rPr>
-                <w:rFonts w:eastAsia="Calibri" w:cs="Arial"/>
                 <w:b/>
                 <w:bCs/>
-                <w:kern w:val="0"/>
-                <w:sz w:val="22"/>
-                <w:szCs w:val="22"/>
-                <w:lang w:val="fr-CH" w:eastAsia="en-US" w:bidi="ar-SA"/>
               </w:rPr>
             </w:r>
           </w:p>
@@ -1663,6 +1654,7 @@
             <w:pPr>
               <w:pStyle w:val="Normal"/>
               <w:widowControl/>
+              <w:suppressAutoHyphens w:val="true"/>
               <w:spacing w:lineRule="auto" w:line="240" w:before="0" w:after="0"/>
               <w:jc w:val="start"/>
               <w:rPr>
@@ -1688,6 +1680,7 @@
             <w:pPr>
               <w:pStyle w:val="Normal"/>
               <w:widowControl/>
+              <w:suppressAutoHyphens w:val="true"/>
               <w:spacing w:lineRule="auto" w:line="240" w:before="0" w:after="0"/>
               <w:jc w:val="start"/>
               <w:rPr>
@@ -1714,6 +1707,7 @@
             <w:pPr>
               <w:pStyle w:val="Normal"/>
               <w:widowControl/>
+              <w:suppressAutoHyphens w:val="true"/>
               <w:spacing w:lineRule="auto" w:line="240" w:before="0" w:after="0"/>
               <w:jc w:val="start"/>
               <w:rPr>
@@ -1723,13 +1717,8 @@
             </w:pPr>
             <w:r>
               <w:rPr>
-                <w:rFonts w:eastAsia="Calibri" w:cs="Arial"/>
                 <w:b/>
                 <w:bCs/>
-                <w:kern w:val="0"/>
-                <w:sz w:val="22"/>
-                <w:szCs w:val="22"/>
-                <w:lang w:val="fr-CH" w:eastAsia="en-US" w:bidi="ar-SA"/>
               </w:rPr>
             </w:r>
           </w:p>
@@ -1746,6 +1735,7 @@
             <w:pPr>
               <w:pStyle w:val="Normal"/>
               <w:widowControl/>
+              <w:suppressAutoHyphens w:val="true"/>
               <w:spacing w:lineRule="auto" w:line="240" w:before="0" w:after="0"/>
               <w:jc w:val="start"/>
               <w:rPr>
@@ -1754,13 +1744,7 @@
               </w:rPr>
             </w:pPr>
             <w:r>
-              <w:rPr>
-                <w:rFonts w:eastAsia="Calibri" w:cs="Arial"/>
-                <w:kern w:val="0"/>
-                <w:sz w:val="22"/>
-                <w:szCs w:val="22"/>
-                <w:lang w:val="fr-CH" w:eastAsia="en-US" w:bidi="ar-SA"/>
-              </w:rPr>
+              <w:rPr/>
               <w:drawing>
                 <wp:inline distT="0" distB="0" distL="0" distR="0">
                   <wp:extent cx="5339715" cy="2545080"/>
@@ -1805,6 +1789,7 @@
             <w:pPr>
               <w:pStyle w:val="Normal"/>
               <w:widowControl/>
+              <w:suppressAutoHyphens w:val="true"/>
               <w:spacing w:lineRule="auto" w:line="240" w:before="0" w:after="0"/>
               <w:jc w:val="start"/>
               <w:rPr>
@@ -1814,20 +1799,16 @@
             </w:pPr>
             <w:r>
               <w:rPr>
-                <w:rFonts w:eastAsia="Calibri" w:cs="Arial"/>
                 <w:b/>
                 <w:bCs/>
-                <w:kern w:val="0"/>
-                <w:sz w:val="22"/>
-                <w:szCs w:val="22"/>
-                <w:lang w:val="fr-CH" w:eastAsia="en-US" w:bidi="ar-SA"/>
-              </w:rPr>
-            </w:r>
-          </w:p>
-          <w:p>
-            <w:pPr>
-              <w:pStyle w:val="Normal"/>
-              <w:widowControl/>
+              </w:rPr>
+            </w:r>
+          </w:p>
+          <w:p>
+            <w:pPr>
+              <w:pStyle w:val="Normal"/>
+              <w:widowControl/>
+              <w:suppressAutoHyphens w:val="true"/>
               <w:spacing w:lineRule="auto" w:line="240" w:before="0" w:after="0"/>
               <w:jc w:val="start"/>
               <w:rPr>
@@ -1837,13 +1818,8 @@
             </w:pPr>
             <w:r>
               <w:rPr>
-                <w:rFonts w:eastAsia="Calibri" w:cs="Arial"/>
                 <w:b/>
                 <w:bCs/>
-                <w:kern w:val="0"/>
-                <w:sz w:val="22"/>
-                <w:szCs w:val="22"/>
-                <w:lang w:val="fr-CH" w:eastAsia="en-US" w:bidi="ar-SA"/>
               </w:rPr>
             </w:r>
           </w:p>
@@ -1860,6 +1836,7 @@
             <w:pPr>
               <w:pStyle w:val="Normal"/>
               <w:widowControl/>
+              <w:suppressAutoHyphens w:val="true"/>
               <w:spacing w:lineRule="auto" w:line="240" w:before="0" w:after="0"/>
               <w:jc w:val="start"/>
               <w:rPr>
@@ -1885,6 +1862,7 @@
             <w:pPr>
               <w:pStyle w:val="Normal"/>
               <w:widowControl/>
+              <w:suppressAutoHyphens w:val="true"/>
               <w:spacing w:lineRule="auto" w:line="240" w:before="0" w:after="0"/>
               <w:jc w:val="start"/>
               <w:rPr>
@@ -1919,6 +1897,7 @@
             <w:pPr>
               <w:pStyle w:val="Normal"/>
               <w:widowControl/>
+              <w:suppressAutoHyphens w:val="true"/>
               <w:spacing w:lineRule="auto" w:line="240" w:before="0" w:after="0"/>
               <w:jc w:val="start"/>
               <w:rPr>
@@ -1928,13 +1907,8 @@
             </w:pPr>
             <w:r>
               <w:rPr>
-                <w:rFonts w:eastAsia="Calibri" w:cs="Arial"/>
                 <w:b/>
                 <w:bCs/>
-                <w:kern w:val="0"/>
-                <w:sz w:val="22"/>
-                <w:szCs w:val="22"/>
-                <w:lang w:val="fr-CH" w:eastAsia="en-US" w:bidi="ar-SA"/>
               </w:rPr>
             </w:r>
           </w:p>
@@ -1951,6 +1925,7 @@
             <w:pPr>
               <w:pStyle w:val="Normal"/>
               <w:widowControl/>
+              <w:suppressAutoHyphens w:val="true"/>
               <w:spacing w:lineRule="auto" w:line="240" w:before="0" w:after="0"/>
               <w:jc w:val="start"/>
               <w:rPr>
@@ -1959,13 +1934,7 @@
               </w:rPr>
             </w:pPr>
             <w:r>
-              <w:rPr>
-                <w:rFonts w:eastAsia="Calibri" w:cs="Arial"/>
-                <w:kern w:val="0"/>
-                <w:sz w:val="22"/>
-                <w:szCs w:val="22"/>
-                <w:lang w:val="fr-CH" w:eastAsia="en-US" w:bidi="ar-SA"/>
-              </w:rPr>
+              <w:rPr/>
               <w:drawing>
                 <wp:inline distT="0" distB="0" distL="0" distR="0">
                   <wp:extent cx="5473700" cy="3878580"/>
@@ -2010,6 +1979,7 @@
             <w:pPr>
               <w:pStyle w:val="Normal"/>
               <w:widowControl/>
+              <w:suppressAutoHyphens w:val="true"/>
               <w:spacing w:lineRule="auto" w:line="240" w:before="0" w:after="0"/>
               <w:jc w:val="start"/>
               <w:rPr>
@@ -2019,20 +1989,16 @@
             </w:pPr>
             <w:r>
               <w:rPr>
-                <w:rFonts w:eastAsia="Calibri" w:cs="Arial"/>
                 <w:b/>
                 <w:bCs/>
-                <w:kern w:val="0"/>
-                <w:sz w:val="22"/>
-                <w:szCs w:val="22"/>
-                <w:lang w:val="fr-CH" w:eastAsia="en-US" w:bidi="ar-SA"/>
-              </w:rPr>
-            </w:r>
-          </w:p>
-          <w:p>
-            <w:pPr>
-              <w:pStyle w:val="Normal"/>
-              <w:widowControl/>
+              </w:rPr>
+            </w:r>
+          </w:p>
+          <w:p>
+            <w:pPr>
+              <w:pStyle w:val="Normal"/>
+              <w:widowControl/>
+              <w:suppressAutoHyphens w:val="true"/>
               <w:spacing w:lineRule="auto" w:line="240" w:before="0" w:after="0"/>
               <w:jc w:val="start"/>
               <w:rPr>
@@ -2042,13 +2008,8 @@
             </w:pPr>
             <w:r>
               <w:rPr>
-                <w:rFonts w:eastAsia="Calibri" w:cs="Arial"/>
                 <w:b/>
                 <w:bCs/>
-                <w:kern w:val="0"/>
-                <w:sz w:val="22"/>
-                <w:szCs w:val="22"/>
-                <w:lang w:val="fr-CH" w:eastAsia="en-US" w:bidi="ar-SA"/>
               </w:rPr>
             </w:r>
           </w:p>
@@ -2065,6 +2026,7 @@
             <w:pPr>
               <w:pStyle w:val="Normal"/>
               <w:widowControl/>
+              <w:suppressAutoHyphens w:val="true"/>
               <w:spacing w:lineRule="auto" w:line="240" w:before="0" w:after="0"/>
               <w:jc w:val="start"/>
               <w:rPr>
@@ -2090,6 +2052,7 @@
             <w:pPr>
               <w:pStyle w:val="Normal"/>
               <w:widowControl/>
+              <w:suppressAutoHyphens w:val="true"/>
               <w:spacing w:lineRule="auto" w:line="240" w:before="0" w:after="0"/>
               <w:jc w:val="start"/>
               <w:rPr>
@@ -2116,6 +2079,7 @@
             <w:pPr>
               <w:pStyle w:val="Normal"/>
               <w:widowControl/>
+              <w:suppressAutoHyphens w:val="true"/>
               <w:spacing w:lineRule="auto" w:line="240" w:before="0" w:after="0"/>
               <w:jc w:val="start"/>
               <w:rPr>
@@ -2125,13 +2089,8 @@
             </w:pPr>
             <w:r>
               <w:rPr>
-                <w:rFonts w:eastAsia="Calibri" w:cs="Arial"/>
                 <w:b/>
                 <w:bCs/>
-                <w:kern w:val="0"/>
-                <w:sz w:val="22"/>
-                <w:szCs w:val="22"/>
-                <w:lang w:val="fr-CH" w:eastAsia="en-US" w:bidi="ar-SA"/>
               </w:rPr>
             </w:r>
           </w:p>
@@ -2148,6 +2107,7 @@
             <w:pPr>
               <w:pStyle w:val="Normal"/>
               <w:widowControl/>
+              <w:suppressAutoHyphens w:val="true"/>
               <w:spacing w:lineRule="auto" w:line="240" w:before="0" w:after="0"/>
               <w:jc w:val="start"/>
               <w:rPr>
@@ -2156,13 +2116,7 @@
               </w:rPr>
             </w:pPr>
             <w:r>
-              <w:rPr>
-                <w:rFonts w:eastAsia="Calibri" w:cs="Arial"/>
-                <w:kern w:val="0"/>
-                <w:sz w:val="22"/>
-                <w:szCs w:val="22"/>
-                <w:lang w:val="fr-CH" w:eastAsia="en-US" w:bidi="ar-SA"/>
-              </w:rPr>
+              <w:rPr/>
               <w:drawing>
                 <wp:inline distT="0" distB="0" distL="0" distR="0">
                   <wp:extent cx="5311140" cy="1213485"/>
@@ -2207,6 +2161,7 @@
             <w:pPr>
               <w:pStyle w:val="Normal"/>
               <w:widowControl/>
+              <w:suppressAutoHyphens w:val="true"/>
               <w:spacing w:lineRule="auto" w:line="240" w:before="0" w:after="0"/>
               <w:jc w:val="start"/>
               <w:rPr>
@@ -2216,20 +2171,16 @@
             </w:pPr>
             <w:r>
               <w:rPr>
-                <w:rFonts w:eastAsia="Calibri" w:cs="Arial"/>
                 <w:b/>
                 <w:bCs/>
-                <w:kern w:val="0"/>
-                <w:sz w:val="22"/>
-                <w:szCs w:val="22"/>
-                <w:lang w:val="fr-CH" w:eastAsia="en-US" w:bidi="ar-SA"/>
-              </w:rPr>
-            </w:r>
-          </w:p>
-          <w:p>
-            <w:pPr>
-              <w:pStyle w:val="Normal"/>
-              <w:widowControl/>
+              </w:rPr>
+            </w:r>
+          </w:p>
+          <w:p>
+            <w:pPr>
+              <w:pStyle w:val="Normal"/>
+              <w:widowControl/>
+              <w:suppressAutoHyphens w:val="true"/>
               <w:spacing w:lineRule="auto" w:line="240" w:before="0" w:after="0"/>
               <w:jc w:val="start"/>
               <w:rPr>
@@ -2239,13 +2190,8 @@
             </w:pPr>
             <w:r>
               <w:rPr>
-                <w:rFonts w:eastAsia="Calibri" w:cs="Arial"/>
                 <w:b/>
                 <w:bCs/>
-                <w:kern w:val="0"/>
-                <w:sz w:val="22"/>
-                <w:szCs w:val="22"/>
-                <w:lang w:val="fr-CH" w:eastAsia="en-US" w:bidi="ar-SA"/>
               </w:rPr>
             </w:r>
           </w:p>
@@ -2262,6 +2208,7 @@
             <w:pPr>
               <w:pStyle w:val="Normal"/>
               <w:widowControl/>
+              <w:suppressAutoHyphens w:val="true"/>
               <w:spacing w:lineRule="auto" w:line="240" w:before="0" w:after="0"/>
               <w:jc w:val="start"/>
               <w:rPr>
@@ -2287,6 +2234,7 @@
             <w:pPr>
               <w:pStyle w:val="Normal"/>
               <w:widowControl/>
+              <w:suppressAutoHyphens w:val="true"/>
               <w:spacing w:lineRule="auto" w:line="240" w:before="0" w:after="0"/>
               <w:jc w:val="start"/>
               <w:rPr>
@@ -2319,6 +2267,7 @@
             <w:pPr>
               <w:pStyle w:val="Normal"/>
               <w:widowControl/>
+              <w:suppressAutoHyphens w:val="true"/>
               <w:spacing w:lineRule="auto" w:line="240" w:before="0" w:after="0"/>
               <w:jc w:val="start"/>
               <w:rPr>
@@ -2327,13 +2276,7 @@
               </w:rPr>
             </w:pPr>
             <w:r>
-              <w:rPr>
-                <w:rFonts w:eastAsia="Calibri" w:cs="Arial"/>
-                <w:kern w:val="0"/>
-                <w:sz w:val="22"/>
-                <w:szCs w:val="22"/>
-                <w:lang w:val="fr-CH" w:eastAsia="en-US" w:bidi="ar-SA"/>
-              </w:rPr>
+              <w:rPr/>
               <w:drawing>
                 <wp:inline distT="0" distB="0" distL="0" distR="0">
                   <wp:extent cx="4922520" cy="3477260"/>
@@ -2378,6 +2321,7 @@
             <w:pPr>
               <w:pStyle w:val="Normal"/>
               <w:widowControl/>
+              <w:suppressAutoHyphens w:val="true"/>
               <w:spacing w:lineRule="auto" w:line="240" w:before="0" w:after="0"/>
               <w:jc w:val="start"/>
               <w:rPr>
@@ -2387,20 +2331,16 @@
             </w:pPr>
             <w:r>
               <w:rPr>
-                <w:rFonts w:eastAsia="Calibri" w:cs="Arial"/>
                 <w:b/>
                 <w:bCs/>
-                <w:kern w:val="0"/>
-                <w:sz w:val="22"/>
-                <w:szCs w:val="22"/>
-                <w:lang w:val="fr-CH" w:eastAsia="en-US" w:bidi="ar-SA"/>
-              </w:rPr>
-            </w:r>
-          </w:p>
-          <w:p>
-            <w:pPr>
-              <w:pStyle w:val="Normal"/>
-              <w:widowControl/>
+              </w:rPr>
+            </w:r>
+          </w:p>
+          <w:p>
+            <w:pPr>
+              <w:pStyle w:val="Normal"/>
+              <w:widowControl/>
+              <w:suppressAutoHyphens w:val="true"/>
               <w:spacing w:lineRule="auto" w:line="240" w:before="0" w:after="0"/>
               <w:jc w:val="start"/>
               <w:rPr>
@@ -2410,20 +2350,16 @@
             </w:pPr>
             <w:r>
               <w:rPr>
-                <w:rFonts w:eastAsia="Calibri" w:cs="Arial"/>
                 <w:b/>
                 <w:bCs/>
-                <w:kern w:val="0"/>
-                <w:sz w:val="22"/>
-                <w:szCs w:val="22"/>
-                <w:lang w:val="fr-CH" w:eastAsia="en-US" w:bidi="ar-SA"/>
-              </w:rPr>
-            </w:r>
-          </w:p>
-          <w:p>
-            <w:pPr>
-              <w:pStyle w:val="Normal"/>
-              <w:widowControl/>
+              </w:rPr>
+            </w:r>
+          </w:p>
+          <w:p>
+            <w:pPr>
+              <w:pStyle w:val="Normal"/>
+              <w:widowControl/>
+              <w:suppressAutoHyphens w:val="true"/>
               <w:spacing w:lineRule="auto" w:line="240" w:before="0" w:after="0"/>
               <w:jc w:val="start"/>
               <w:rPr>
@@ -2433,13 +2369,8 @@
             </w:pPr>
             <w:r>
               <w:rPr>
-                <w:rFonts w:eastAsia="Calibri" w:cs="Arial"/>
                 <w:b/>
                 <w:bCs/>
-                <w:kern w:val="0"/>
-                <w:sz w:val="22"/>
-                <w:szCs w:val="22"/>
-                <w:lang w:val="fr-CH" w:eastAsia="en-US" w:bidi="ar-SA"/>
               </w:rPr>
             </w:r>
           </w:p>
@@ -2456,6 +2387,7 @@
             <w:pPr>
               <w:pStyle w:val="Normal"/>
               <w:widowControl/>
+              <w:suppressAutoHyphens w:val="true"/>
               <w:spacing w:lineRule="auto" w:line="240" w:before="0" w:after="0"/>
               <w:jc w:val="start"/>
               <w:rPr>
@@ -2481,6 +2413,7 @@
             <w:pPr>
               <w:pStyle w:val="Normal"/>
               <w:widowControl/>
+              <w:suppressAutoHyphens w:val="true"/>
               <w:spacing w:lineRule="auto" w:line="240" w:before="0" w:after="0"/>
               <w:jc w:val="start"/>
               <w:rPr>
@@ -2507,6 +2440,7 @@
             <w:pPr>
               <w:pStyle w:val="Normal"/>
               <w:widowControl/>
+              <w:suppressAutoHyphens w:val="true"/>
               <w:spacing w:lineRule="auto" w:line="240" w:before="0" w:after="0"/>
               <w:jc w:val="start"/>
               <w:rPr>
@@ -2516,13 +2450,8 @@
             </w:pPr>
             <w:r>
               <w:rPr>
-                <w:rFonts w:eastAsia="Calibri" w:cs="Arial"/>
                 <w:b/>
                 <w:bCs/>
-                <w:kern w:val="0"/>
-                <w:sz w:val="22"/>
-                <w:szCs w:val="22"/>
-                <w:lang w:val="fr-CH" w:eastAsia="en-US" w:bidi="ar-SA"/>
               </w:rPr>
             </w:r>
           </w:p>
@@ -2539,6 +2468,7 @@
             <w:pPr>
               <w:pStyle w:val="Normal"/>
               <w:widowControl/>
+              <w:suppressAutoHyphens w:val="true"/>
               <w:spacing w:lineRule="auto" w:line="240" w:before="0" w:after="0"/>
               <w:jc w:val="start"/>
               <w:rPr>
@@ -2575,6 +2505,7 @@
             <w:pPr>
               <w:pStyle w:val="Normal"/>
               <w:widowControl/>
+              <w:suppressAutoHyphens w:val="true"/>
               <w:spacing w:lineRule="auto" w:line="240" w:before="0" w:after="0"/>
               <w:jc w:val="start"/>
               <w:rPr>
@@ -2599,6 +2530,7 @@
             <w:pPr>
               <w:pStyle w:val="Normal"/>
               <w:widowControl/>
+              <w:suppressAutoHyphens w:val="true"/>
               <w:spacing w:lineRule="auto" w:line="240" w:before="0" w:after="0"/>
               <w:jc w:val="start"/>
               <w:rPr>
@@ -2608,13 +2540,8 @@
             </w:pPr>
             <w:r>
               <w:rPr>
-                <w:rFonts w:eastAsia="Calibri" w:cs="Arial"/>
                 <w:b/>
                 <w:bCs/>
-                <w:kern w:val="0"/>
-                <w:sz w:val="22"/>
-                <w:szCs w:val="22"/>
-                <w:lang w:val="fr-CH" w:eastAsia="en-US" w:bidi="ar-SA"/>
               </w:rPr>
             </w:r>
           </w:p>
@@ -2631,6 +2558,7 @@
             <w:pPr>
               <w:pStyle w:val="Normal"/>
               <w:widowControl/>
+              <w:suppressAutoHyphens w:val="true"/>
               <w:spacing w:lineRule="auto" w:line="240" w:before="0" w:after="0"/>
               <w:jc w:val="start"/>
               <w:rPr>
@@ -2639,13 +2567,7 @@
               </w:rPr>
             </w:pPr>
             <w:r>
-              <w:rPr>
-                <w:rFonts w:eastAsia="Calibri" w:cs="Arial"/>
-                <w:kern w:val="0"/>
-                <w:sz w:val="22"/>
-                <w:szCs w:val="22"/>
-                <w:lang w:val="fr-CH" w:eastAsia="en-US" w:bidi="ar-SA"/>
-              </w:rPr>
+              <w:rPr/>
               <w:drawing>
                 <wp:inline distT="0" distB="0" distL="0" distR="0">
                   <wp:extent cx="1402080" cy="1283970"/>
@@ -2690,6 +2612,7 @@
             <w:pPr>
               <w:pStyle w:val="Normal"/>
               <w:widowControl/>
+              <w:suppressAutoHyphens w:val="true"/>
               <w:spacing w:lineRule="auto" w:line="240" w:before="0" w:after="0"/>
               <w:jc w:val="start"/>
               <w:rPr>
@@ -2699,20 +2622,16 @@
             </w:pPr>
             <w:r>
               <w:rPr>
-                <w:rFonts w:eastAsia="Calibri" w:cs="Arial"/>
                 <w:b/>
                 <w:bCs/>
-                <w:kern w:val="0"/>
-                <w:sz w:val="22"/>
-                <w:szCs w:val="22"/>
-                <w:lang w:val="fr-CH" w:eastAsia="en-US" w:bidi="ar-SA"/>
-              </w:rPr>
-            </w:r>
-          </w:p>
-          <w:p>
-            <w:pPr>
-              <w:pStyle w:val="Normal"/>
-              <w:widowControl/>
+              </w:rPr>
+            </w:r>
+          </w:p>
+          <w:p>
+            <w:pPr>
+              <w:pStyle w:val="Normal"/>
+              <w:widowControl/>
+              <w:suppressAutoHyphens w:val="true"/>
               <w:spacing w:lineRule="auto" w:line="240" w:before="0" w:after="0"/>
               <w:jc w:val="start"/>
               <w:rPr>
@@ -2722,13 +2641,8 @@
             </w:pPr>
             <w:r>
               <w:rPr>
-                <w:rFonts w:eastAsia="Calibri" w:cs="Arial"/>
                 <w:b/>
                 <w:bCs/>
-                <w:kern w:val="0"/>
-                <w:sz w:val="22"/>
-                <w:szCs w:val="22"/>
-                <w:lang w:val="fr-CH" w:eastAsia="en-US" w:bidi="ar-SA"/>
               </w:rPr>
             </w:r>
           </w:p>
@@ -2745,6 +2659,7 @@
             <w:pPr>
               <w:pStyle w:val="Normal"/>
               <w:widowControl/>
+              <w:suppressAutoHyphens w:val="true"/>
               <w:spacing w:lineRule="auto" w:line="240" w:before="0" w:after="0"/>
               <w:jc w:val="start"/>
               <w:rPr>
@@ -2770,6 +2685,7 @@
             <w:pPr>
               <w:pStyle w:val="Normal"/>
               <w:widowControl/>
+              <w:suppressAutoHyphens w:val="true"/>
               <w:spacing w:lineRule="auto" w:line="240" w:before="0" w:after="0"/>
               <w:jc w:val="start"/>
               <w:rPr>
@@ -2792,6 +2708,7 @@
             <w:pPr>
               <w:pStyle w:val="Normal"/>
               <w:widowControl/>
+              <w:suppressAutoHyphens w:val="true"/>
               <w:spacing w:lineRule="auto" w:line="240" w:before="0" w:after="0"/>
               <w:jc w:val="start"/>
               <w:rPr>
@@ -2801,13 +2718,8 @@
             </w:pPr>
             <w:r>
               <w:rPr>
-                <w:rFonts w:eastAsia="Calibri" w:cs="Arial"/>
                 <w:b/>
                 <w:bCs/>
-                <w:kern w:val="0"/>
-                <w:sz w:val="22"/>
-                <w:szCs w:val="22"/>
-                <w:lang w:val="fr-CH" w:eastAsia="en-US" w:bidi="ar-SA"/>
               </w:rPr>
             </w:r>
           </w:p>
@@ -2824,6 +2736,7 @@
             <w:pPr>
               <w:pStyle w:val="Normal"/>
               <w:widowControl/>
+              <w:suppressAutoHyphens w:val="true"/>
               <w:spacing w:lineRule="auto" w:line="240" w:before="0" w:after="0"/>
               <w:jc w:val="start"/>
               <w:rPr>
@@ -2832,13 +2745,7 @@
               </w:rPr>
             </w:pPr>
             <w:r>
-              <w:rPr>
-                <w:rFonts w:eastAsia="Calibri" w:cs="Arial"/>
-                <w:kern w:val="0"/>
-                <w:sz w:val="22"/>
-                <w:szCs w:val="22"/>
-                <w:lang w:val="fr-CH" w:eastAsia="en-US" w:bidi="ar-SA"/>
-              </w:rPr>
+              <w:rPr/>
               <w:drawing>
                 <wp:inline distT="0" distB="0" distL="0" distR="0">
                   <wp:extent cx="2505075" cy="1879600"/>
@@ -2879,13 +2786,7 @@
               </w:drawing>
             </w:r>
             <w:r>
-              <w:rPr>
-                <w:rFonts w:eastAsia="Calibri" w:cs="Arial"/>
-                <w:kern w:val="0"/>
-                <w:sz w:val="22"/>
-                <w:szCs w:val="22"/>
-                <w:lang w:val="fr-CH" w:eastAsia="en-US" w:bidi="ar-SA"/>
-              </w:rPr>
+              <w:rPr/>
               <w:drawing>
                 <wp:inline distT="0" distB="0" distL="0" distR="0">
                   <wp:extent cx="2493645" cy="2051050"/>
@@ -2930,6 +2831,7 @@
             <w:pPr>
               <w:pStyle w:val="Normal"/>
               <w:widowControl/>
+              <w:suppressAutoHyphens w:val="true"/>
               <w:spacing w:lineRule="auto" w:line="240" w:before="0" w:after="0"/>
               <w:jc w:val="start"/>
               <w:rPr>
@@ -2939,20 +2841,16 @@
             </w:pPr>
             <w:r>
               <w:rPr>
-                <w:rFonts w:eastAsia="Calibri" w:cs="Arial"/>
                 <w:b/>
                 <w:bCs/>
-                <w:kern w:val="0"/>
-                <w:sz w:val="22"/>
-                <w:szCs w:val="22"/>
-                <w:lang w:val="fr-CH" w:eastAsia="en-US" w:bidi="ar-SA"/>
-              </w:rPr>
-            </w:r>
-          </w:p>
-          <w:p>
-            <w:pPr>
-              <w:pStyle w:val="Normal"/>
-              <w:widowControl/>
+              </w:rPr>
+            </w:r>
+          </w:p>
+          <w:p>
+            <w:pPr>
+              <w:pStyle w:val="Normal"/>
+              <w:widowControl/>
+              <w:suppressAutoHyphens w:val="true"/>
               <w:spacing w:lineRule="auto" w:line="240" w:before="0" w:after="0"/>
               <w:jc w:val="start"/>
               <w:rPr>
@@ -2986,6 +2884,7 @@
             <w:pPr>
               <w:pStyle w:val="Normal"/>
               <w:widowControl/>
+              <w:suppressAutoHyphens w:val="true"/>
               <w:spacing w:lineRule="auto" w:line="240" w:before="0" w:after="0"/>
               <w:jc w:val="start"/>
               <w:rPr>
@@ -3011,6 +2910,7 @@
             <w:pPr>
               <w:pStyle w:val="Normal"/>
               <w:widowControl/>
+              <w:suppressAutoHyphens w:val="true"/>
               <w:spacing w:lineRule="auto" w:line="240" w:before="0" w:after="0"/>
               <w:jc w:val="start"/>
               <w:rPr>
@@ -3044,6 +2944,7 @@
             <w:pPr>
               <w:pStyle w:val="Normal"/>
               <w:widowControl/>
+              <w:suppressAutoHyphens w:val="true"/>
               <w:spacing w:lineRule="auto" w:line="240" w:before="0" w:after="0"/>
               <w:jc w:val="start"/>
               <w:rPr>
@@ -3053,13 +2954,8 @@
             </w:pPr>
             <w:r>
               <w:rPr>
-                <w:rFonts w:eastAsia="Calibri" w:cs="Arial"/>
                 <w:b/>
                 <w:bCs/>
-                <w:kern w:val="0"/>
-                <w:sz w:val="22"/>
-                <w:szCs w:val="22"/>
-                <w:lang w:val="fr-CH" w:eastAsia="en-US" w:bidi="ar-SA"/>
               </w:rPr>
             </w:r>
           </w:p>
@@ -3076,6 +2972,7 @@
             <w:pPr>
               <w:pStyle w:val="Normal"/>
               <w:widowControl/>
+              <w:suppressAutoHyphens w:val="true"/>
               <w:spacing w:lineRule="auto" w:line="240" w:before="0" w:after="0"/>
               <w:jc w:val="start"/>
               <w:rPr>
@@ -3084,13 +2981,7 @@
               </w:rPr>
             </w:pPr>
             <w:r>
-              <w:rPr>
-                <w:rFonts w:eastAsia="Calibri" w:cs="Arial"/>
-                <w:kern w:val="0"/>
-                <w:sz w:val="22"/>
-                <w:szCs w:val="22"/>
-                <w:lang w:val="fr-CH" w:eastAsia="en-US" w:bidi="ar-SA"/>
-              </w:rPr>
+              <w:rPr/>
               <w:drawing>
                 <wp:inline distT="0" distB="0" distL="0" distR="0">
                   <wp:extent cx="1560830" cy="1695450"/>
@@ -3143,13 +3034,7 @@
               <w:t xml:space="preserve"> </w:t>
             </w:r>
             <w:r>
-              <w:rPr>
-                <w:rFonts w:eastAsia="Calibri" w:cs="Arial"/>
-                <w:kern w:val="0"/>
-                <w:sz w:val="22"/>
-                <w:szCs w:val="22"/>
-                <w:lang w:val="fr-CH" w:eastAsia="en-US" w:bidi="ar-SA"/>
-              </w:rPr>
+              <w:rPr/>
               <w:drawing>
                 <wp:inline distT="0" distB="0" distL="0" distR="0">
                   <wp:extent cx="1998980" cy="2127250"/>
@@ -3190,13 +3075,7 @@
               </w:drawing>
             </w:r>
             <w:r>
-              <w:rPr>
-                <w:rFonts w:eastAsia="Calibri" w:cs="Arial"/>
-                <w:kern w:val="0"/>
-                <w:sz w:val="22"/>
-                <w:szCs w:val="22"/>
-                <w:lang w:val="fr-CH" w:eastAsia="en-US" w:bidi="ar-SA"/>
-              </w:rPr>
+              <w:rPr/>
               <w:drawing>
                 <wp:inline distT="0" distB="0" distL="0" distR="0">
                   <wp:extent cx="1905000" cy="1868805"/>
@@ -3241,6 +3120,7 @@
             <w:pPr>
               <w:pStyle w:val="Normal"/>
               <w:widowControl/>
+              <w:suppressAutoHyphens w:val="true"/>
               <w:spacing w:lineRule="auto" w:line="240" w:before="0" w:after="0"/>
               <w:jc w:val="start"/>
               <w:rPr>
@@ -3250,20 +3130,16 @@
             </w:pPr>
             <w:r>
               <w:rPr>
-                <w:rFonts w:eastAsia="Calibri" w:cs="Arial"/>
                 <w:b/>
                 <w:bCs/>
-                <w:kern w:val="0"/>
-                <w:sz w:val="22"/>
-                <w:szCs w:val="22"/>
-                <w:lang w:val="fr-CH" w:eastAsia="en-US" w:bidi="ar-SA"/>
-              </w:rPr>
-            </w:r>
-          </w:p>
-          <w:p>
-            <w:pPr>
-              <w:pStyle w:val="Normal"/>
-              <w:widowControl/>
+              </w:rPr>
+            </w:r>
+          </w:p>
+          <w:p>
+            <w:pPr>
+              <w:pStyle w:val="Normal"/>
+              <w:widowControl/>
+              <w:suppressAutoHyphens w:val="true"/>
               <w:spacing w:lineRule="auto" w:line="240" w:before="0" w:after="0"/>
               <w:jc w:val="start"/>
               <w:rPr>
@@ -3297,6 +3173,7 @@
             <w:pPr>
               <w:pStyle w:val="Normal"/>
               <w:widowControl/>
+              <w:suppressAutoHyphens w:val="true"/>
               <w:spacing w:lineRule="auto" w:line="240" w:before="0" w:after="0"/>
               <w:jc w:val="start"/>
               <w:rPr>
@@ -3322,6 +3199,7 @@
             <w:pPr>
               <w:pStyle w:val="Normal"/>
               <w:widowControl/>
+              <w:suppressAutoHyphens w:val="true"/>
               <w:spacing w:lineRule="auto" w:line="240" w:before="0" w:after="0"/>
               <w:jc w:val="start"/>
               <w:rPr>
@@ -3357,6 +3235,7 @@
             <w:pPr>
               <w:pStyle w:val="Normal"/>
               <w:widowControl/>
+              <w:suppressAutoHyphens w:val="true"/>
               <w:spacing w:lineRule="auto" w:line="240" w:before="0" w:after="0"/>
               <w:jc w:val="start"/>
               <w:rPr>
@@ -3365,13 +3244,7 @@
               </w:rPr>
             </w:pPr>
             <w:r>
-              <w:rPr>
-                <w:rFonts w:eastAsia="Calibri" w:cs="Arial"/>
-                <w:kern w:val="0"/>
-                <w:sz w:val="22"/>
-                <w:szCs w:val="22"/>
-                <w:lang w:val="fr-CH" w:eastAsia="en-US" w:bidi="ar-SA"/>
-              </w:rPr>
+              <w:rPr/>
               <w:drawing>
                 <wp:inline distT="0" distB="0" distL="0" distR="0">
                   <wp:extent cx="2482850" cy="2402840"/>
@@ -3416,6 +3289,7 @@
             <w:pPr>
               <w:pStyle w:val="Normal"/>
               <w:widowControl/>
+              <w:suppressAutoHyphens w:val="true"/>
               <w:spacing w:lineRule="auto" w:line="240" w:before="0" w:after="0"/>
               <w:jc w:val="start"/>
               <w:rPr>
@@ -3425,20 +3299,16 @@
             </w:pPr>
             <w:r>
               <w:rPr>
-                <w:rFonts w:eastAsia="Calibri" w:cs="Arial"/>
                 <w:b/>
                 <w:bCs/>
-                <w:kern w:val="0"/>
-                <w:sz w:val="22"/>
-                <w:szCs w:val="22"/>
-                <w:lang w:val="fr-CH" w:eastAsia="en-US" w:bidi="ar-SA"/>
-              </w:rPr>
-            </w:r>
-          </w:p>
-          <w:p>
-            <w:pPr>
-              <w:pStyle w:val="Normal"/>
-              <w:widowControl/>
+              </w:rPr>
+            </w:r>
+          </w:p>
+          <w:p>
+            <w:pPr>
+              <w:pStyle w:val="Normal"/>
+              <w:widowControl/>
+              <w:suppressAutoHyphens w:val="true"/>
               <w:spacing w:lineRule="auto" w:line="240" w:before="0" w:after="0"/>
               <w:jc w:val="start"/>
               <w:rPr>
@@ -3472,6 +3342,7 @@
             <w:pPr>
               <w:pStyle w:val="Normal"/>
               <w:widowControl/>
+              <w:suppressAutoHyphens w:val="true"/>
               <w:spacing w:lineRule="auto" w:line="240" w:before="0" w:after="0"/>
               <w:jc w:val="start"/>
               <w:rPr>
@@ -3497,6 +3368,7 @@
             <w:pPr>
               <w:pStyle w:val="Normal"/>
               <w:widowControl/>
+              <w:suppressAutoHyphens w:val="true"/>
               <w:spacing w:lineRule="auto" w:line="240" w:before="0" w:after="0"/>
               <w:jc w:val="start"/>
               <w:rPr>
@@ -3523,6 +3395,7 @@
             <w:pPr>
               <w:pStyle w:val="Normal"/>
               <w:widowControl/>
+              <w:suppressAutoHyphens w:val="true"/>
               <w:spacing w:lineRule="auto" w:line="240" w:before="0" w:after="0"/>
               <w:jc w:val="start"/>
               <w:rPr>
@@ -3532,13 +3405,8 @@
             </w:pPr>
             <w:r>
               <w:rPr>
-                <w:rFonts w:eastAsia="Calibri" w:cs="Arial"/>
                 <w:b/>
                 <w:bCs/>
-                <w:kern w:val="0"/>
-                <w:sz w:val="22"/>
-                <w:szCs w:val="22"/>
-                <w:lang w:val="fr-CH" w:eastAsia="en-US" w:bidi="ar-SA"/>
               </w:rPr>
             </w:r>
           </w:p>
@@ -3555,6 +3423,7 @@
             <w:pPr>
               <w:pStyle w:val="Normal"/>
               <w:widowControl/>
+              <w:suppressAutoHyphens w:val="true"/>
               <w:spacing w:lineRule="auto" w:line="240" w:before="0" w:after="0"/>
               <w:jc w:val="start"/>
               <w:rPr>
@@ -3563,13 +3432,7 @@
               </w:rPr>
             </w:pPr>
             <w:r>
-              <w:rPr>
-                <w:rFonts w:eastAsia="Calibri" w:cs="Arial"/>
-                <w:kern w:val="0"/>
-                <w:sz w:val="22"/>
-                <w:szCs w:val="22"/>
-                <w:lang w:val="fr-CH" w:eastAsia="en-US" w:bidi="ar-SA"/>
-              </w:rPr>
+              <w:rPr/>
               <w:drawing>
                 <wp:inline distT="0" distB="0" distL="0" distR="0">
                   <wp:extent cx="2292350" cy="2566035"/>
@@ -3614,6 +3477,7 @@
             <w:pPr>
               <w:pStyle w:val="Normal"/>
               <w:widowControl/>
+              <w:suppressAutoHyphens w:val="true"/>
               <w:spacing w:lineRule="auto" w:line="240" w:before="0" w:after="0"/>
               <w:jc w:val="start"/>
               <w:rPr>
@@ -3623,20 +3487,16 @@
             </w:pPr>
             <w:r>
               <w:rPr>
-                <w:rFonts w:eastAsia="Calibri" w:cs="Arial"/>
                 <w:b/>
                 <w:bCs/>
-                <w:kern w:val="0"/>
-                <w:sz w:val="22"/>
-                <w:szCs w:val="22"/>
-                <w:lang w:val="fr-CH" w:eastAsia="en-US" w:bidi="ar-SA"/>
-              </w:rPr>
-            </w:r>
-          </w:p>
-          <w:p>
-            <w:pPr>
-              <w:pStyle w:val="Normal"/>
-              <w:widowControl/>
+              </w:rPr>
+            </w:r>
+          </w:p>
+          <w:p>
+            <w:pPr>
+              <w:pStyle w:val="Normal"/>
+              <w:widowControl/>
+              <w:suppressAutoHyphens w:val="true"/>
               <w:spacing w:lineRule="auto" w:line="240" w:before="0" w:after="0"/>
               <w:jc w:val="start"/>
               <w:rPr>
@@ -3704,21 +3564,7 @@
           <w:b/>
           <w:bCs/>
         </w:rPr>
-        <w:t>Compare</w:t>
-      </w:r>
-      <w:r>
-        <w:rPr>
-          <w:b/>
-          <w:bCs/>
-        </w:rPr>
-        <w:t>z</w:t>
-      </w:r>
-      <w:r>
-        <w:rPr>
-          <w:b/>
-          <w:bCs/>
-        </w:rPr>
-        <w:t xml:space="preserve"> les parties 2 et 3.1.</w:t>
+        <w:t>Comparez les parties 2 et 3.1.</w:t>
       </w:r>
     </w:p>
     <w:p>
@@ -3783,31 +3629,7 @@
         <w:rPr>
           <w:color w:themeColor="dark1" w:val="000000"/>
         </w:rPr>
-        <w:t>Ouvr</w:t>
-      </w:r>
-      <w:r>
-        <w:rPr>
-          <w:color w:themeColor="dark1" w:val="000000"/>
-        </w:rPr>
-        <w:t>ez</w:t>
-      </w:r>
-      <w:r>
-        <w:rPr>
-          <w:color w:themeColor="dark1" w:val="000000"/>
-        </w:rPr>
-        <w:t xml:space="preserve"> l'ordinateur et pren</w:t>
-      </w:r>
-      <w:r>
-        <w:rPr>
-          <w:color w:themeColor="dark1" w:val="000000"/>
-        </w:rPr>
-        <w:t>ez</w:t>
-      </w:r>
-      <w:r>
-        <w:rPr>
-          <w:color w:themeColor="dark1" w:val="000000"/>
-        </w:rPr>
-        <w:t xml:space="preserve"> une photo de l'ensemble. (Cela vous permettra notamment de vérifier à la fin que vous avez tout remis à sa place.) </w:t>
+        <w:t xml:space="preserve">Ouvrez l'ordinateur et prenez une photo de l'ensemble. (Cela vous permettra notamment de vérifier à la fin que vous avez tout remis à sa place.) </w:t>
       </w:r>
     </w:p>
     <w:p>
@@ -3827,43 +3649,7 @@
         <w:rPr>
           <w:color w:themeColor="dark1" w:val="000000"/>
         </w:rPr>
-        <w:t>Recherche</w:t>
-      </w:r>
-      <w:r>
-        <w:rPr>
-          <w:color w:themeColor="dark1" w:val="000000"/>
-        </w:rPr>
-        <w:t>z</w:t>
-      </w:r>
-      <w:r>
-        <w:rPr>
-          <w:color w:themeColor="dark1" w:val="000000"/>
-        </w:rPr>
-        <w:t xml:space="preserve"> les différents composants, pren</w:t>
-      </w:r>
-      <w:r>
-        <w:rPr>
-          <w:color w:themeColor="dark1" w:val="000000"/>
-        </w:rPr>
-        <w:t>ez</w:t>
-      </w:r>
-      <w:r>
-        <w:rPr>
-          <w:color w:themeColor="dark1" w:val="000000"/>
-        </w:rPr>
-        <w:t xml:space="preserve"> une photo et ajoute</w:t>
-      </w:r>
-      <w:r>
-        <w:rPr>
-          <w:color w:themeColor="dark1" w:val="000000"/>
-        </w:rPr>
-        <w:t>z-là</w:t>
-      </w:r>
-      <w:r>
-        <w:rPr>
-          <w:color w:themeColor="dark1" w:val="000000"/>
-        </w:rPr>
-        <w:t xml:space="preserve"> à votre document.</w:t>
+        <w:t>Recherchez les différents composants, prenez une photo et ajoutez-là à votre document.</w:t>
       </w:r>
     </w:p>
     <w:p>
@@ -3883,31 +3669,7 @@
         <w:rPr>
           <w:color w:themeColor="dark1" w:val="000000"/>
         </w:rPr>
-        <w:t>Ajoute</w:t>
-      </w:r>
-      <w:r>
-        <w:rPr>
-          <w:color w:themeColor="dark1" w:val="000000"/>
-        </w:rPr>
-        <w:t>z</w:t>
-      </w:r>
-      <w:r>
-        <w:rPr>
-          <w:color w:themeColor="dark1" w:val="000000"/>
-        </w:rPr>
-        <w:t xml:space="preserve"> la photo prise en a) et nomme</w:t>
-      </w:r>
-      <w:r>
-        <w:rPr>
-          <w:color w:themeColor="dark1" w:val="000000"/>
-        </w:rPr>
-        <w:t>z</w:t>
-      </w:r>
-      <w:r>
-        <w:rPr>
-          <w:color w:themeColor="dark1" w:val="000000"/>
-        </w:rPr>
-        <w:t xml:space="preserve"> les différentes parties avec des flèches. (Dans Word: Insertion/Formes) </w:t>
+        <w:t xml:space="preserve">Ajoutez la photo prise en a) et nommez les différentes parties avec des flèches. (Dans Word: Insertion/Formes) </w:t>
       </w:r>
     </w:p>
     <w:p>
@@ -3929,7 +3691,7 @@
         <mc:AlternateContent>
           <mc:Choice Requires="wps">
             <w:drawing>
-              <wp:anchor distT="40640" distB="60960" distL="109220" distR="121920" simplePos="0" relativeHeight="32" behindDoc="0" locked="0" layoutInCell="0" allowOverlap="1" wp14:anchorId="0743409A">
+              <wp:anchor distT="40005" distB="60960" distL="109220" distR="121920" simplePos="0" relativeHeight="26" behindDoc="0" locked="0" layoutInCell="0" allowOverlap="1" wp14:anchorId="0743409A">
                 <wp:simplePos x="0" y="0"/>
                 <wp:positionH relativeFrom="column">
                   <wp:posOffset>120650</wp:posOffset>
@@ -3973,7 +3735,7 @@
                         <w:txbxContent>
                           <w:p>
                             <w:pPr>
-                              <w:pStyle w:val="Contenudecadre"/>
+                              <w:pStyle w:val="Contenudecadreuser"/>
                               <w:rPr>
                                 <w:color w:val="FF0000"/>
                               </w:rPr>
@@ -4008,7 +3770,7 @@
                   <w:txbxContent>
                     <w:p>
                       <w:pPr>
-                        <w:pStyle w:val="Contenudecadre"/>
+                        <w:pStyle w:val="Contenudecadreuser"/>
                         <w:rPr>
                           <w:color w:val="FF0000"/>
                         </w:rPr>
@@ -4030,7 +3792,7 @@
         <mc:AlternateContent>
           <mc:Choice Requires="wps">
             <w:drawing>
-              <wp:anchor distT="40640" distB="60960" distL="109220" distR="121920" simplePos="0" relativeHeight="41" behindDoc="0" locked="0" layoutInCell="0" allowOverlap="1" wp14:anchorId="184DC995">
+              <wp:anchor distT="40005" distB="60960" distL="109220" distR="121920" simplePos="0" relativeHeight="37" behindDoc="0" locked="0" layoutInCell="0" allowOverlap="1" wp14:anchorId="184DC995">
                 <wp:simplePos x="0" y="0"/>
                 <wp:positionH relativeFrom="column">
                   <wp:posOffset>2482850</wp:posOffset>
@@ -4074,7 +3836,7 @@
                         <w:txbxContent>
                           <w:p>
                             <w:pPr>
-                              <w:pStyle w:val="Contenudecadre"/>
+                              <w:pStyle w:val="Contenudecadreuser"/>
                               <w:rPr>
                                 <w:color w:val="FF0000"/>
                               </w:rPr>
@@ -4109,7 +3871,7 @@
                   <w:txbxContent>
                     <w:p>
                       <w:pPr>
-                        <w:pStyle w:val="Contenudecadre"/>
+                        <w:pStyle w:val="Contenudecadreuser"/>
                         <w:rPr>
                           <w:color w:val="FF0000"/>
                         </w:rPr>
@@ -4166,7 +3928,7 @@
         <mc:AlternateContent>
           <mc:Choice Requires="wps">
             <w:drawing>
-              <wp:anchor distT="19050" distB="38100" distL="19050" distR="50800" simplePos="0" relativeHeight="23" behindDoc="0" locked="0" layoutInCell="1" allowOverlap="1" wp14:anchorId="4131A670">
+              <wp:anchor distT="14605" distB="635" distL="13335" distR="635" simplePos="0" relativeHeight="17" behindDoc="0" locked="0" layoutInCell="1" allowOverlap="1" wp14:anchorId="4131A670">
                 <wp:simplePos x="0" y="0"/>
                 <wp:positionH relativeFrom="column">
                   <wp:posOffset>3244850</wp:posOffset>
@@ -4234,7 +3996,7 @@
         <mc:AlternateContent>
           <mc:Choice Requires="wps">
             <w:drawing>
-              <wp:anchor distT="19050" distB="50800" distL="19050" distR="57150" simplePos="0" relativeHeight="24" behindDoc="0" locked="0" layoutInCell="1" allowOverlap="1" wp14:anchorId="61D488A6">
+              <wp:anchor distT="13335" distB="635" distL="14605" distR="635" simplePos="0" relativeHeight="18" behindDoc="0" locked="0" layoutInCell="1" allowOverlap="1" wp14:anchorId="61D488A6">
                 <wp:simplePos x="0" y="0"/>
                 <wp:positionH relativeFrom="column">
                   <wp:posOffset>889000</wp:posOffset>
@@ -4311,13 +4073,13 @@
         <mc:AlternateContent>
           <mc:Choice Requires="wps">
             <w:drawing>
-              <wp:anchor distT="38100" distB="25400" distL="19050" distR="50800" simplePos="0" relativeHeight="25" behindDoc="0" locked="0" layoutInCell="1" allowOverlap="1" wp14:anchorId="5D7398BB">
+              <wp:anchor distT="635" distB="12700" distL="14605" distR="1270" simplePos="0" relativeHeight="19" behindDoc="0" locked="0" layoutInCell="1" allowOverlap="1" wp14:anchorId="5D7398BB">
                 <wp:simplePos x="0" y="0"/>
                 <wp:positionH relativeFrom="column">
                   <wp:posOffset>0</wp:posOffset>
                 </wp:positionH>
                 <wp:positionV relativeFrom="paragraph">
-                  <wp:posOffset>3561715</wp:posOffset>
+                  <wp:posOffset>3560445</wp:posOffset>
                 </wp:positionV>
                 <wp:extent cx="825500" cy="946150"/>
                 <wp:effectExtent l="14605" t="635" r="1270" b="12700"/>
@@ -4364,7 +4126,7 @@
           </mc:Choice>
           <mc:Fallback>
             <w:pict>
-              <v:shape id="shape_0" stroked="t" o:allowincell="f" style="position:absolute;margin-left:-0.05pt;margin-top:280.45pt;width:64.95pt;height:74.45pt;flip:y;mso-wrap-style:none;v-text-anchor:middle" wp14:anchorId="5D7398BB" type="_x0000_t32" path="m0,0l-2147483648,-2147483647e">
+              <v:shape id="shape_0" stroked="t" o:allowincell="f" style="position:absolute;margin-left:-0.05pt;margin-top:280.35pt;width:64.95pt;height:74.45pt;flip:y;mso-wrap-style:none;v-text-anchor:middle" wp14:anchorId="5D7398BB" type="_x0000_t32" path="m0,0l-2147483648,-2147483647e">
                 <v:fill o:detectmouseclick="t" on="false"/>
                 <v:stroke color="red" weight="38160" endarrow="block" endarrowwidth="medium" endarrowlength="medium" joinstyle="miter" endcap="flat"/>
                 <w10:wrap type="none"/>
@@ -4375,13 +4137,13 @@
         <mc:AlternateContent>
           <mc:Choice Requires="wps">
             <w:drawing>
-              <wp:anchor distT="38100" distB="19050" distL="19050" distR="44450" simplePos="0" relativeHeight="26" behindDoc="0" locked="0" layoutInCell="1" allowOverlap="1" wp14:anchorId="20EE37B8">
+              <wp:anchor distT="635" distB="12065" distL="15240" distR="635" simplePos="0" relativeHeight="20" behindDoc="0" locked="0" layoutInCell="1" allowOverlap="1" wp14:anchorId="20EE37B8">
                 <wp:simplePos x="0" y="0"/>
                 <wp:positionH relativeFrom="column">
-                  <wp:posOffset>1732915</wp:posOffset>
+                  <wp:posOffset>1732280</wp:posOffset>
                 </wp:positionH>
                 <wp:positionV relativeFrom="paragraph">
-                  <wp:posOffset>3339465</wp:posOffset>
+                  <wp:posOffset>3338195</wp:posOffset>
                 </wp:positionV>
                 <wp:extent cx="1041400" cy="1371600"/>
                 <wp:effectExtent l="15240" t="635" r="635" b="12065"/>
@@ -4428,7 +4190,7 @@
           </mc:Choice>
           <mc:Fallback>
             <w:pict>
-              <v:shape id="shape_0" stroked="t" o:allowincell="f" style="position:absolute;margin-left:136.45pt;margin-top:262.95pt;width:81.95pt;height:107.95pt;flip:y;mso-wrap-style:none;v-text-anchor:middle" wp14:anchorId="20EE37B8" type="_x0000_t32" path="m0,0l-2147483648,-2147483647e">
+              <v:shape id="shape_0" stroked="t" o:allowincell="f" style="position:absolute;margin-left:136.4pt;margin-top:262.85pt;width:81.95pt;height:107.95pt;flip:y;mso-wrap-style:none;v-text-anchor:middle" wp14:anchorId="20EE37B8" type="_x0000_t32" path="m0,0l-2147483648,-2147483647e">
                 <v:fill o:detectmouseclick="t" on="false"/>
                 <v:stroke color="red" weight="38160" endarrow="block" endarrowwidth="medium" endarrowlength="medium" joinstyle="miter" endcap="flat"/>
                 <w10:wrap type="none"/>
@@ -4439,13 +4201,13 @@
         <mc:AlternateContent>
           <mc:Choice Requires="wps">
             <w:drawing>
-              <wp:anchor distT="38100" distB="12700" distL="76200" distR="19050" simplePos="0" relativeHeight="27" behindDoc="0" locked="0" layoutInCell="1" allowOverlap="1" wp14:anchorId="039390EE">
+              <wp:anchor distT="635" distB="3810" distL="34925" distR="19050" simplePos="0" relativeHeight="21" behindDoc="0" locked="0" layoutInCell="1" allowOverlap="1" wp14:anchorId="039390EE">
                 <wp:simplePos x="0" y="0"/>
                 <wp:positionH relativeFrom="column">
-                  <wp:posOffset>4081780</wp:posOffset>
+                  <wp:posOffset>4080510</wp:posOffset>
                 </wp:positionH>
                 <wp:positionV relativeFrom="paragraph">
-                  <wp:posOffset>2679065</wp:posOffset>
+                  <wp:posOffset>2677795</wp:posOffset>
                 </wp:positionV>
                 <wp:extent cx="361950" cy="1854200"/>
                 <wp:effectExtent l="34925" t="635" r="19050" b="3810"/>
@@ -4492,7 +4254,7 @@
           </mc:Choice>
           <mc:Fallback>
             <w:pict>
-              <v:shape id="shape_0" stroked="t" o:allowincell="f" style="position:absolute;margin-left:321.4pt;margin-top:210.95pt;width:28.45pt;height:145.95pt;flip:xy;mso-wrap-style:none;v-text-anchor:middle" wp14:anchorId="039390EE" type="_x0000_t32" path="m0,0l-2147483648,-2147483647e">
+              <v:shape id="shape_0" stroked="t" o:allowincell="f" style="position:absolute;margin-left:321.3pt;margin-top:210.85pt;width:28.45pt;height:145.95pt;flip:xy;mso-wrap-style:none;v-text-anchor:middle" wp14:anchorId="039390EE" type="_x0000_t32" path="m0,0l-2147483648,-2147483647e">
                 <v:fill o:detectmouseclick="t" on="false"/>
                 <v:stroke color="red" weight="38160" endarrow="block" endarrowwidth="medium" endarrowlength="medium" joinstyle="miter" endcap="flat"/>
                 <w10:wrap type="none"/>
@@ -4503,13 +4265,13 @@
         <mc:AlternateContent>
           <mc:Choice Requires="wps">
             <w:drawing>
-              <wp:anchor distT="38100" distB="6350" distL="19050" distR="57150" simplePos="0" relativeHeight="28" behindDoc="0" locked="0" layoutInCell="1" allowOverlap="1" wp14:anchorId="4E1FF1C7">
+              <wp:anchor distT="1270" distB="3810" distL="19050" distR="38100" simplePos="0" relativeHeight="22" behindDoc="0" locked="0" layoutInCell="1" allowOverlap="1" wp14:anchorId="4E1FF1C7">
                 <wp:simplePos x="0" y="0"/>
                 <wp:positionH relativeFrom="column">
-                  <wp:posOffset>2856865</wp:posOffset>
+                  <wp:posOffset>2856230</wp:posOffset>
                 </wp:positionH>
                 <wp:positionV relativeFrom="paragraph">
-                  <wp:posOffset>2266315</wp:posOffset>
+                  <wp:posOffset>2265045</wp:posOffset>
                 </wp:positionV>
                 <wp:extent cx="419100" cy="2432050"/>
                 <wp:effectExtent l="19050" t="1270" r="38100" b="3810"/>
@@ -4556,7 +4318,7 @@
           </mc:Choice>
           <mc:Fallback>
             <w:pict>
-              <v:shape id="shape_0" stroked="t" o:allowincell="f" style="position:absolute;margin-left:224.95pt;margin-top:178.45pt;width:32.95pt;height:191.45pt;flip:y;mso-wrap-style:none;v-text-anchor:middle" wp14:anchorId="4E1FF1C7" type="_x0000_t32" path="m0,0l-2147483648,-2147483647e">
+              <v:shape id="shape_0" stroked="t" o:allowincell="f" style="position:absolute;margin-left:224.9pt;margin-top:178.35pt;width:32.95pt;height:191.45pt;flip:y;mso-wrap-style:none;v-text-anchor:middle" wp14:anchorId="4E1FF1C7" type="_x0000_t32" path="m0,0l-2147483648,-2147483647e">
                 <v:fill o:detectmouseclick="t" on="false"/>
                 <v:stroke color="red" weight="38160" endarrow="block" endarrowwidth="medium" endarrowlength="medium" joinstyle="miter" endcap="flat"/>
                 <w10:wrap type="none"/>
@@ -4567,10 +4329,10 @@
         <mc:AlternateContent>
           <mc:Choice Requires="wps">
             <w:drawing>
-              <wp:anchor distT="19050" distB="82550" distL="38100" distR="19050" simplePos="0" relativeHeight="29" behindDoc="0" locked="0" layoutInCell="1" allowOverlap="1" wp14:anchorId="2060A85D">
+              <wp:anchor distT="19050" distB="36195" distL="635" distR="3810" simplePos="0" relativeHeight="23" behindDoc="0" locked="0" layoutInCell="1" allowOverlap="1" wp14:anchorId="2060A85D">
                 <wp:simplePos x="0" y="0"/>
                 <wp:positionH relativeFrom="column">
-                  <wp:posOffset>3841115</wp:posOffset>
+                  <wp:posOffset>3840480</wp:posOffset>
                 </wp:positionH>
                 <wp:positionV relativeFrom="paragraph">
                   <wp:posOffset>1911985</wp:posOffset>
@@ -4620,7 +4382,7 @@
           </mc:Choice>
           <mc:Fallback>
             <w:pict>
-              <v:shape id="shape_0" stroked="t" o:allowincell="f" style="position:absolute;margin-left:302.45pt;margin-top:150.55pt;width:86.95pt;height:15.95pt;flip:x;mso-wrap-style:none;v-text-anchor:middle" wp14:anchorId="2060A85D" type="_x0000_t32" path="m0,0l-2147483648,-2147483647e">
+              <v:shape id="shape_0" stroked="t" o:allowincell="f" style="position:absolute;margin-left:302.4pt;margin-top:150.55pt;width:86.95pt;height:15.95pt;flip:x;mso-wrap-style:none;v-text-anchor:middle" wp14:anchorId="2060A85D" type="_x0000_t32" path="m0,0l-2147483648,-2147483647e">
                 <v:fill o:detectmouseclick="t" on="false"/>
                 <v:stroke color="red" weight="38160" endarrow="block" endarrowwidth="medium" endarrowlength="medium" joinstyle="miter" endcap="flat"/>
                 <w10:wrap type="none"/>
@@ -4631,7 +4393,7 @@
         <mc:AlternateContent>
           <mc:Choice Requires="wps">
             <w:drawing>
-              <wp:anchor distT="19050" distB="19050" distL="19050" distR="25400" simplePos="0" relativeHeight="30" behindDoc="0" locked="0" layoutInCell="1" allowOverlap="1" wp14:anchorId="16D0785F">
+              <wp:anchor distT="19050" distB="19050" distL="19050" distR="19050" simplePos="0" relativeHeight="24" behindDoc="0" locked="0" layoutInCell="1" allowOverlap="1" wp14:anchorId="16D0785F">
                 <wp:simplePos x="0" y="0"/>
                 <wp:positionH relativeFrom="column">
                   <wp:posOffset>2038350</wp:posOffset>
@@ -4696,13 +4458,13 @@
         <mc:AlternateContent>
           <mc:Choice Requires="wps">
             <w:drawing>
-              <wp:anchor distT="38100" distB="31750" distL="38100" distR="25400" simplePos="0" relativeHeight="31" behindDoc="0" locked="0" layoutInCell="1" allowOverlap="1" wp14:anchorId="2FAFBDA1">
+              <wp:anchor distT="635" distB="16510" distL="635" distR="10160" simplePos="0" relativeHeight="25" behindDoc="0" locked="0" layoutInCell="1" allowOverlap="1" wp14:anchorId="2FAFBDA1">
                 <wp:simplePos x="0" y="0"/>
                 <wp:positionH relativeFrom="column">
-                  <wp:posOffset>4551680</wp:posOffset>
+                  <wp:posOffset>4550410</wp:posOffset>
                 </wp:positionH>
                 <wp:positionV relativeFrom="paragraph">
-                  <wp:posOffset>3999865</wp:posOffset>
+                  <wp:posOffset>3998595</wp:posOffset>
                 </wp:positionV>
                 <wp:extent cx="869950" cy="520700"/>
                 <wp:effectExtent l="635" t="635" r="10160" b="16510"/>
@@ -4749,7 +4511,7 @@
           </mc:Choice>
           <mc:Fallback>
             <w:pict>
-              <v:shape id="shape_0" stroked="t" o:allowincell="f" style="position:absolute;margin-left:358.4pt;margin-top:314.95pt;width:68.45pt;height:40.95pt;flip:xy;mso-wrap-style:none;v-text-anchor:middle" wp14:anchorId="2FAFBDA1" type="_x0000_t32" path="m0,0l-2147483648,-2147483647e">
+              <v:shape id="shape_0" stroked="t" o:allowincell="f" style="position:absolute;margin-left:358.3pt;margin-top:314.85pt;width:68.45pt;height:40.95pt;flip:xy;mso-wrap-style:none;v-text-anchor:middle" wp14:anchorId="2FAFBDA1" type="_x0000_t32" path="m0,0l-2147483648,-2147483647e">
                 <v:fill o:detectmouseclick="t" on="false"/>
                 <v:stroke color="red" weight="38160" endarrow="block" endarrowwidth="medium" endarrowlength="medium" joinstyle="miter" endcap="flat"/>
                 <w10:wrap type="none"/>
@@ -4760,7 +4522,7 @@
         <mc:AlternateContent>
           <mc:Choice Requires="wps">
             <w:drawing>
-              <wp:anchor distT="0" distB="20320" distL="0" distR="12700" simplePos="0" relativeHeight="45" behindDoc="0" locked="0" layoutInCell="0" allowOverlap="1" wp14:anchorId="7E017DB9">
+              <wp:anchor distT="5715" distB="4445" distL="5080" distR="5080" simplePos="0" relativeHeight="39" behindDoc="0" locked="0" layoutInCell="0" allowOverlap="1" wp14:anchorId="7E017DB9">
                 <wp:simplePos x="0" y="0"/>
                 <wp:positionH relativeFrom="page">
                   <wp:posOffset>5883910</wp:posOffset>
@@ -4804,7 +4566,7 @@
                         <w:txbxContent>
                           <w:p>
                             <w:pPr>
-                              <w:pStyle w:val="Contenudecadre"/>
+                              <w:pStyle w:val="Contenudecadreuser"/>
                               <w:rPr>
                                 <w:color w:val="FF0000"/>
                               </w:rPr>
@@ -4839,7 +4601,7 @@
                   <w:txbxContent>
                     <w:p>
                       <w:pPr>
-                        <w:pStyle w:val="Contenudecadre"/>
+                        <w:pStyle w:val="Contenudecadreuser"/>
                         <w:rPr>
                           <w:color w:val="FF0000"/>
                         </w:rPr>
@@ -4908,7 +4670,7 @@
         <mc:AlternateContent>
           <mc:Choice Requires="wps">
             <w:drawing>
-              <wp:anchor distT="40640" distB="60960" distL="109220" distR="121920" simplePos="0" relativeHeight="47" behindDoc="0" locked="0" layoutInCell="0" allowOverlap="1" wp14:anchorId="066B4215">
+              <wp:anchor distT="40005" distB="60960" distL="109220" distR="121920" simplePos="0" relativeHeight="41" behindDoc="0" locked="0" layoutInCell="0" allowOverlap="1" wp14:anchorId="066B4215">
                 <wp:simplePos x="0" y="0"/>
                 <wp:positionH relativeFrom="column">
                   <wp:posOffset>-717550</wp:posOffset>
@@ -4952,7 +4714,7 @@
                         <w:txbxContent>
                           <w:p>
                             <w:pPr>
-                              <w:pStyle w:val="Contenudecadre"/>
+                              <w:pStyle w:val="Contenudecadreuser"/>
                               <w:rPr>
                                 <w:color w:val="FF0000"/>
                               </w:rPr>
@@ -4987,7 +4749,7 @@
                   <w:txbxContent>
                     <w:p>
                       <w:pPr>
-                        <w:pStyle w:val="Contenudecadre"/>
+                        <w:pStyle w:val="Contenudecadreuser"/>
                         <w:rPr>
                           <w:color w:val="FF0000"/>
                         </w:rPr>
@@ -5023,7 +4785,7 @@
         <mc:AlternateContent>
           <mc:Choice Requires="wps">
             <w:drawing>
-              <wp:anchor distT="40640" distB="60960" distL="109220" distR="121920" simplePos="0" relativeHeight="34" behindDoc="0" locked="0" layoutInCell="0" allowOverlap="1" wp14:anchorId="3843C934">
+              <wp:anchor distT="40005" distB="60960" distL="109220" distR="121920" simplePos="0" relativeHeight="28" behindDoc="0" locked="0" layoutInCell="0" allowOverlap="1" wp14:anchorId="3843C934">
                 <wp:simplePos x="0" y="0"/>
                 <wp:positionH relativeFrom="column">
                   <wp:posOffset>5149850</wp:posOffset>
@@ -5067,7 +4829,7 @@
                         <w:txbxContent>
                           <w:p>
                             <w:pPr>
-                              <w:pStyle w:val="Contenudecadre"/>
+                              <w:pStyle w:val="Contenudecadreuser"/>
                               <w:rPr>
                                 <w:color w:val="FF0000"/>
                               </w:rPr>
@@ -5102,7 +4864,7 @@
                   <w:txbxContent>
                     <w:p>
                       <w:pPr>
-                        <w:pStyle w:val="Contenudecadre"/>
+                        <w:pStyle w:val="Contenudecadreuser"/>
                         <w:rPr>
                           <w:color w:val="FF0000"/>
                         </w:rPr>
@@ -5124,7 +4886,7 @@
         <mc:AlternateContent>
           <mc:Choice Requires="wps">
             <w:drawing>
-              <wp:anchor distT="40640" distB="60960" distL="109220" distR="121920" simplePos="0" relativeHeight="36" behindDoc="0" locked="0" layoutInCell="0" allowOverlap="1" wp14:anchorId="0B62D78C">
+              <wp:anchor distT="40005" distB="60325" distL="109220" distR="121920" simplePos="0" relativeHeight="30" behindDoc="0" locked="0" layoutInCell="0" allowOverlap="1" wp14:anchorId="0B62D78C">
                 <wp:simplePos x="0" y="0"/>
                 <wp:positionH relativeFrom="column">
                   <wp:posOffset>3702050</wp:posOffset>
@@ -5168,7 +4930,7 @@
                         <w:txbxContent>
                           <w:p>
                             <w:pPr>
-                              <w:pStyle w:val="Contenudecadre"/>
+                              <w:pStyle w:val="Contenudecadreuser"/>
                               <w:rPr>
                                 <w:color w:val="FF0000"/>
                               </w:rPr>
@@ -5182,7 +4944,7 @@
                           </w:p>
                           <w:p>
                             <w:pPr>
-                              <w:pStyle w:val="Contenudecadre"/>
+                              <w:pStyle w:val="Contenudecadreuser"/>
                               <w:rPr>
                                 <w:color w:val="FF0000"/>
                               </w:rPr>
@@ -5217,7 +4979,7 @@
                   <w:txbxContent>
                     <w:p>
                       <w:pPr>
-                        <w:pStyle w:val="Contenudecadre"/>
+                        <w:pStyle w:val="Contenudecadreuser"/>
                         <w:rPr>
                           <w:color w:val="FF0000"/>
                         </w:rPr>
@@ -5231,7 +4993,7 @@
                     </w:p>
                     <w:p>
                       <w:pPr>
-                        <w:pStyle w:val="Contenudecadre"/>
+                        <w:pStyle w:val="Contenudecadreuser"/>
                         <w:rPr>
                           <w:color w:val="FF0000"/>
                         </w:rPr>
@@ -5253,7 +5015,7 @@
         <mc:AlternateContent>
           <mc:Choice Requires="wps">
             <w:drawing>
-              <wp:anchor distT="40640" distB="60960" distL="109220" distR="121920" simplePos="0" relativeHeight="39" behindDoc="0" locked="0" layoutInCell="0" allowOverlap="1" wp14:anchorId="7D09B21F">
+              <wp:anchor distT="40005" distB="60960" distL="109220" distR="121920" simplePos="0" relativeHeight="32" behindDoc="0" locked="0" layoutInCell="0" allowOverlap="1" wp14:anchorId="7D09B21F">
                 <wp:simplePos x="0" y="0"/>
                 <wp:positionH relativeFrom="margin">
                   <wp:align>center</wp:align>
@@ -5297,7 +5059,7 @@
                         <w:txbxContent>
                           <w:p>
                             <w:pPr>
-                              <w:pStyle w:val="Contenudecadre"/>
+                              <w:pStyle w:val="Contenudecadreuser"/>
                               <w:rPr>
                                 <w:color w:val="FF0000"/>
                               </w:rPr>
@@ -5332,7 +5094,7 @@
                   <w:txbxContent>
                     <w:p>
                       <w:pPr>
-                        <w:pStyle w:val="Contenudecadre"/>
+                        <w:pStyle w:val="Contenudecadreuser"/>
                         <w:rPr>
                           <w:color w:val="FF0000"/>
                         </w:rPr>
@@ -5354,7 +5116,7 @@
         <mc:AlternateContent>
           <mc:Choice Requires="wps">
             <w:drawing>
-              <wp:anchor distT="40640" distB="67310" distL="109220" distR="133985" simplePos="0" relativeHeight="43" behindDoc="0" locked="0" layoutInCell="0" allowOverlap="1" wp14:anchorId="04A079AA">
+              <wp:anchor distT="40005" distB="66675" distL="109220" distR="133350" simplePos="0" relativeHeight="35" behindDoc="0" locked="0" layoutInCell="0" allowOverlap="1" wp14:anchorId="04A079AA">
                 <wp:simplePos x="0" y="0"/>
                 <wp:positionH relativeFrom="column">
                   <wp:posOffset>717550</wp:posOffset>
@@ -5398,7 +5160,7 @@
                         <w:txbxContent>
                           <w:p>
                             <w:pPr>
-                              <w:pStyle w:val="Contenudecadre"/>
+                              <w:pStyle w:val="Contenudecadreuser"/>
                               <w:rPr>
                                 <w:color w:val="FF0000"/>
                               </w:rPr>
@@ -5433,7 +5195,7 @@
                   <w:txbxContent>
                     <w:p>
                       <w:pPr>
-                        <w:pStyle w:val="Contenudecadre"/>
+                        <w:pStyle w:val="Contenudecadreuser"/>
                         <w:rPr>
                           <w:color w:val="FF0000"/>
                         </w:rPr>
@@ -5480,13 +5242,545 @@
       </w:pPr>
       <w:r>
         <w:rPr/>
+        <w:t>Disque dur</w:t>
+      </w:r>
+    </w:p>
+    <w:p>
+      <w:pPr>
+        <w:pStyle w:val="Normal"/>
+        <w:ind w:hanging="578" w:start="578"/>
+        <w:rPr/>
+      </w:pPr>
+      <w:r>
+        <w:rPr/>
+        <w:t>Il existe deux types de disques durs :</w:t>
+      </w:r>
+    </w:p>
+    <w:p>
+      <w:pPr>
+        <w:pStyle w:val="Normal"/>
+        <w:numPr>
+          <w:ilvl w:val="0"/>
+          <w:numId w:val="7"/>
+        </w:numPr>
+        <w:rPr/>
+      </w:pPr>
+      <w:r>
+        <w:rPr/>
+        <w:t>HDD (Hard Disk Drive)</w:t>
+      </w:r>
+    </w:p>
+    <w:p>
+      <w:pPr>
+        <w:pStyle w:val="Normal"/>
+        <w:numPr>
+          <w:ilvl w:val="0"/>
+          <w:numId w:val="7"/>
+        </w:numPr>
+        <w:rPr/>
+      </w:pPr>
+      <w:r>
+        <w:rPr/>
+        <w:t>SSD (Solid-State Drive)</w:t>
+      </w:r>
+    </w:p>
+    <w:p>
+      <w:pPr>
+        <w:pStyle w:val="Normal"/>
+        <w:ind w:hanging="578" w:start="578"/>
+        <w:rPr/>
+      </w:pPr>
+      <w:r>
+        <w:rPr/>
+        <w:t>Complétez le tableau de comparaison ci-dessous en recherchant l’information si nécessaire:</w:t>
+      </w:r>
+    </w:p>
+    <w:tbl>
+      <w:tblPr>
+        <w:tblW w:w="9021" w:type="dxa"/>
+        <w:jc w:val="start"/>
+        <w:tblInd w:w="-5" w:type="dxa"/>
+        <w:tblLayout w:type="fixed"/>
+        <w:tblCellMar>
+          <w:top w:w="55" w:type="dxa"/>
+          <w:start w:w="55" w:type="dxa"/>
+          <w:bottom w:w="55" w:type="dxa"/>
+          <w:end w:w="55" w:type="dxa"/>
+        </w:tblCellMar>
+      </w:tblPr>
+      <w:tblGrid>
+        <w:gridCol w:w="1813"/>
+        <w:gridCol w:w="3604"/>
+        <w:gridCol w:w="3604"/>
+      </w:tblGrid>
+      <w:tr>
+        <w:trPr/>
+        <w:tc>
+          <w:tcPr>
+            <w:tcW w:w="1813" w:type="dxa"/>
+            <w:tcBorders>
+              <w:top w:val="single" w:sz="4" w:space="0" w:color="000000"/>
+              <w:start w:val="single" w:sz="4" w:space="0" w:color="000000"/>
+              <w:bottom w:val="single" w:sz="4" w:space="0" w:color="000000"/>
+            </w:tcBorders>
+          </w:tcPr>
+          <w:p>
+            <w:pPr>
+              <w:pStyle w:val="Contenudetableau"/>
+              <w:ind w:hanging="578" w:start="578"/>
+              <w:rPr/>
+            </w:pPr>
+            <w:r>
+              <w:rPr/>
+            </w:r>
+          </w:p>
+        </w:tc>
+        <w:tc>
+          <w:tcPr>
+            <w:tcW w:w="3604" w:type="dxa"/>
+            <w:tcBorders>
+              <w:top w:val="single" w:sz="4" w:space="0" w:color="000000"/>
+              <w:start w:val="single" w:sz="4" w:space="0" w:color="000000"/>
+              <w:bottom w:val="single" w:sz="4" w:space="0" w:color="000000"/>
+            </w:tcBorders>
+          </w:tcPr>
+          <w:p>
+            <w:pPr>
+              <w:pStyle w:val="Contenudetableau"/>
+              <w:ind w:hanging="578" w:start="578"/>
+              <w:jc w:val="center"/>
+              <w:rPr>
+                <w:b/>
+                <w:bCs/>
+              </w:rPr>
+            </w:pPr>
+            <w:r>
+              <w:rPr>
+                <w:b/>
+                <w:bCs/>
+              </w:rPr>
+              <w:t>HDD</w:t>
+            </w:r>
+          </w:p>
+        </w:tc>
+        <w:tc>
+          <w:tcPr>
+            <w:tcW w:w="3604" w:type="dxa"/>
+            <w:tcBorders>
+              <w:top w:val="single" w:sz="4" w:space="0" w:color="000000"/>
+              <w:start w:val="single" w:sz="4" w:space="0" w:color="000000"/>
+              <w:bottom w:val="single" w:sz="4" w:space="0" w:color="000000"/>
+              <w:end w:val="single" w:sz="4" w:space="0" w:color="000000"/>
+            </w:tcBorders>
+          </w:tcPr>
+          <w:p>
+            <w:pPr>
+              <w:pStyle w:val="Contenudetableau"/>
+              <w:ind w:hanging="578" w:start="578"/>
+              <w:jc w:val="center"/>
+              <w:rPr>
+                <w:b/>
+                <w:bCs/>
+              </w:rPr>
+            </w:pPr>
+            <w:r>
+              <w:rPr>
+                <w:b/>
+                <w:bCs/>
+              </w:rPr>
+              <w:t>SDD</w:t>
+            </w:r>
+          </w:p>
+        </w:tc>
+      </w:tr>
+      <w:tr>
+        <w:trPr/>
+        <w:tc>
+          <w:tcPr>
+            <w:tcW w:w="1813" w:type="dxa"/>
+            <w:tcBorders>
+              <w:start w:val="single" w:sz="4" w:space="0" w:color="000000"/>
+              <w:bottom w:val="single" w:sz="4" w:space="0" w:color="000000"/>
+            </w:tcBorders>
+          </w:tcPr>
+          <w:p>
+            <w:pPr>
+              <w:pStyle w:val="Contenudetableau"/>
+              <w:ind w:hanging="578" w:start="578"/>
+              <w:rPr>
+                <w:b/>
+                <w:bCs/>
+              </w:rPr>
+            </w:pPr>
+            <w:r>
+              <w:rPr>
+                <w:b/>
+                <w:bCs/>
+              </w:rPr>
+              <w:t>Technologie</w:t>
+            </w:r>
+          </w:p>
+        </w:tc>
+        <w:tc>
+          <w:tcPr>
+            <w:tcW w:w="3604" w:type="dxa"/>
+            <w:tcBorders>
+              <w:start w:val="single" w:sz="4" w:space="0" w:color="000000"/>
+              <w:bottom w:val="single" w:sz="4" w:space="0" w:color="000000"/>
+            </w:tcBorders>
+          </w:tcPr>
+          <w:p>
+            <w:pPr>
+              <w:pStyle w:val="Contenudetableau"/>
+              <w:ind w:hanging="578" w:start="578"/>
+              <w:rPr/>
+            </w:pPr>
+            <w:r>
+              <w:rPr/>
+              <w:t>Disques magnétiques rotatifs</w:t>
+            </w:r>
+          </w:p>
+        </w:tc>
+        <w:tc>
+          <w:tcPr>
+            <w:tcW w:w="3604" w:type="dxa"/>
+            <w:tcBorders>
+              <w:start w:val="single" w:sz="4" w:space="0" w:color="000000"/>
+              <w:bottom w:val="single" w:sz="4" w:space="0" w:color="000000"/>
+              <w:end w:val="single" w:sz="4" w:space="0" w:color="000000"/>
+            </w:tcBorders>
+          </w:tcPr>
+          <w:p>
+            <w:pPr>
+              <w:pStyle w:val="Contenudetableau"/>
+              <w:ind w:hanging="578" w:start="578"/>
+              <w:rPr/>
+            </w:pPr>
+            <w:r>
+              <w:rPr/>
+              <w:t>Mémoire flash</w:t>
+            </w:r>
+          </w:p>
+        </w:tc>
+      </w:tr>
+      <w:tr>
+        <w:trPr/>
+        <w:tc>
+          <w:tcPr>
+            <w:tcW w:w="1813" w:type="dxa"/>
+            <w:tcBorders>
+              <w:start w:val="single" w:sz="4" w:space="0" w:color="000000"/>
+              <w:bottom w:val="single" w:sz="4" w:space="0" w:color="000000"/>
+            </w:tcBorders>
+          </w:tcPr>
+          <w:p>
+            <w:pPr>
+              <w:pStyle w:val="Contenudetableau"/>
+              <w:ind w:hanging="578" w:start="578"/>
+              <w:rPr>
+                <w:b/>
+                <w:bCs/>
+              </w:rPr>
+            </w:pPr>
+            <w:r>
+              <w:rPr>
+                <w:b/>
+                <w:bCs/>
+              </w:rPr>
+              <w:t>Mécanisme</w:t>
+            </w:r>
+          </w:p>
+        </w:tc>
+        <w:tc>
+          <w:tcPr>
+            <w:tcW w:w="3604" w:type="dxa"/>
+            <w:tcBorders>
+              <w:start w:val="single" w:sz="4" w:space="0" w:color="000000"/>
+              <w:bottom w:val="single" w:sz="4" w:space="0" w:color="000000"/>
+            </w:tcBorders>
+          </w:tcPr>
+          <w:p>
+            <w:pPr>
+              <w:pStyle w:val="Contenudetableau"/>
+              <w:ind w:hanging="578" w:start="578"/>
+              <w:rPr/>
+            </w:pPr>
+            <w:r>
+              <w:rPr/>
+              <w:t>Mécanique</w:t>
+            </w:r>
+          </w:p>
+        </w:tc>
+        <w:tc>
+          <w:tcPr>
+            <w:tcW w:w="3604" w:type="dxa"/>
+            <w:tcBorders>
+              <w:start w:val="single" w:sz="4" w:space="0" w:color="000000"/>
+              <w:bottom w:val="single" w:sz="4" w:space="0" w:color="000000"/>
+              <w:end w:val="single" w:sz="4" w:space="0" w:color="000000"/>
+            </w:tcBorders>
+          </w:tcPr>
+          <w:p>
+            <w:pPr>
+              <w:pStyle w:val="Contenudetableau"/>
+              <w:ind w:hanging="578" w:start="578"/>
+              <w:rPr/>
+            </w:pPr>
+            <w:r>
+              <w:rPr/>
+              <w:t>Électronique</w:t>
+            </w:r>
+          </w:p>
+        </w:tc>
+      </w:tr>
+      <w:tr>
+        <w:trPr/>
+        <w:tc>
+          <w:tcPr>
+            <w:tcW w:w="1813" w:type="dxa"/>
+            <w:tcBorders>
+              <w:start w:val="single" w:sz="4" w:space="0" w:color="000000"/>
+              <w:bottom w:val="single" w:sz="4" w:space="0" w:color="000000"/>
+            </w:tcBorders>
+          </w:tcPr>
+          <w:p>
+            <w:pPr>
+              <w:pStyle w:val="Contenudetableau"/>
+              <w:ind w:hanging="578" w:start="578"/>
+              <w:rPr>
+                <w:b/>
+                <w:bCs/>
+              </w:rPr>
+            </w:pPr>
+            <w:r>
+              <w:rPr>
+                <w:b/>
+                <w:bCs/>
+              </w:rPr>
+              <w:t>Vitesse</w:t>
+            </w:r>
+          </w:p>
+        </w:tc>
+        <w:tc>
+          <w:tcPr>
+            <w:tcW w:w="3604" w:type="dxa"/>
+            <w:tcBorders>
+              <w:start w:val="single" w:sz="4" w:space="0" w:color="000000"/>
+              <w:bottom w:val="single" w:sz="4" w:space="0" w:color="000000"/>
+            </w:tcBorders>
+          </w:tcPr>
+          <w:p>
+            <w:pPr>
+              <w:pStyle w:val="Contenudetableau"/>
+              <w:ind w:hanging="578" w:start="578"/>
+              <w:rPr/>
+            </w:pPr>
+            <w:r>
+              <w:rPr/>
+              <w:t>Plus lent</w:t>
+            </w:r>
+          </w:p>
+        </w:tc>
+        <w:tc>
+          <w:tcPr>
+            <w:tcW w:w="3604" w:type="dxa"/>
+            <w:tcBorders>
+              <w:start w:val="single" w:sz="4" w:space="0" w:color="000000"/>
+              <w:bottom w:val="single" w:sz="4" w:space="0" w:color="000000"/>
+              <w:end w:val="single" w:sz="4" w:space="0" w:color="000000"/>
+            </w:tcBorders>
+          </w:tcPr>
+          <w:p>
+            <w:pPr>
+              <w:pStyle w:val="Contenudetableau"/>
+              <w:ind w:hanging="578" w:start="578"/>
+              <w:rPr/>
+            </w:pPr>
+            <w:r>
+              <w:rPr/>
+              <w:t>Très rapide</w:t>
+            </w:r>
+          </w:p>
+        </w:tc>
+      </w:tr>
+      <w:tr>
+        <w:trPr/>
+        <w:tc>
+          <w:tcPr>
+            <w:tcW w:w="1813" w:type="dxa"/>
+            <w:tcBorders>
+              <w:start w:val="single" w:sz="4" w:space="0" w:color="000000"/>
+              <w:bottom w:val="single" w:sz="4" w:space="0" w:color="000000"/>
+            </w:tcBorders>
+          </w:tcPr>
+          <w:p>
+            <w:pPr>
+              <w:pStyle w:val="Contenudetableau"/>
+              <w:ind w:hanging="578" w:start="578"/>
+              <w:rPr>
+                <w:b/>
+                <w:bCs/>
+              </w:rPr>
+            </w:pPr>
+            <w:r>
+              <w:rPr>
+                <w:b/>
+                <w:bCs/>
+              </w:rPr>
+              <w:t>Prix</w:t>
+            </w:r>
+          </w:p>
+        </w:tc>
+        <w:tc>
+          <w:tcPr>
+            <w:tcW w:w="3604" w:type="dxa"/>
+            <w:tcBorders>
+              <w:start w:val="single" w:sz="4" w:space="0" w:color="000000"/>
+              <w:bottom w:val="single" w:sz="4" w:space="0" w:color="000000"/>
+            </w:tcBorders>
+          </w:tcPr>
+          <w:p>
+            <w:pPr>
+              <w:pStyle w:val="Contenudetableau"/>
+              <w:ind w:hanging="578" w:start="578"/>
+              <w:rPr/>
+            </w:pPr>
+            <w:r>
+              <w:rPr/>
+              <w:t>Moins cher</w:t>
+            </w:r>
+          </w:p>
+        </w:tc>
+        <w:tc>
+          <w:tcPr>
+            <w:tcW w:w="3604" w:type="dxa"/>
+            <w:tcBorders>
+              <w:start w:val="single" w:sz="4" w:space="0" w:color="000000"/>
+              <w:bottom w:val="single" w:sz="4" w:space="0" w:color="000000"/>
+              <w:end w:val="single" w:sz="4" w:space="0" w:color="000000"/>
+            </w:tcBorders>
+          </w:tcPr>
+          <w:p>
+            <w:pPr>
+              <w:pStyle w:val="Contenudetableau"/>
+              <w:ind w:hanging="578" w:start="578"/>
+              <w:rPr/>
+            </w:pPr>
+            <w:r>
+              <w:rPr/>
+              <w:t>Plus cher</w:t>
+            </w:r>
+          </w:p>
+        </w:tc>
+      </w:tr>
+      <w:tr>
+        <w:trPr/>
+        <w:tc>
+          <w:tcPr>
+            <w:tcW w:w="1813" w:type="dxa"/>
+            <w:tcBorders>
+              <w:start w:val="single" w:sz="4" w:space="0" w:color="000000"/>
+              <w:bottom w:val="single" w:sz="4" w:space="0" w:color="000000"/>
+            </w:tcBorders>
+          </w:tcPr>
+          <w:p>
+            <w:pPr>
+              <w:pStyle w:val="Contenudetableau"/>
+              <w:ind w:hanging="578" w:start="578"/>
+              <w:rPr>
+                <w:b/>
+                <w:bCs/>
+              </w:rPr>
+            </w:pPr>
+            <w:r>
+              <w:rPr>
+                <w:b/>
+                <w:bCs/>
+              </w:rPr>
+              <w:t>Fragilité</w:t>
+            </w:r>
+          </w:p>
+        </w:tc>
+        <w:tc>
+          <w:tcPr>
+            <w:tcW w:w="3604" w:type="dxa"/>
+            <w:tcBorders>
+              <w:start w:val="single" w:sz="4" w:space="0" w:color="000000"/>
+              <w:bottom w:val="single" w:sz="4" w:space="0" w:color="000000"/>
+            </w:tcBorders>
+          </w:tcPr>
+          <w:p>
+            <w:pPr>
+              <w:pStyle w:val="Contenudetableau"/>
+              <w:ind w:hanging="578" w:start="578"/>
+              <w:rPr/>
+            </w:pPr>
+            <w:r>
+              <w:rPr/>
+              <w:t>Fragile aux chocs</w:t>
+            </w:r>
+          </w:p>
+        </w:tc>
+        <w:tc>
+          <w:tcPr>
+            <w:tcW w:w="3604" w:type="dxa"/>
+            <w:tcBorders>
+              <w:start w:val="single" w:sz="4" w:space="0" w:color="000000"/>
+              <w:bottom w:val="single" w:sz="4" w:space="0" w:color="000000"/>
+              <w:end w:val="single" w:sz="4" w:space="0" w:color="000000"/>
+            </w:tcBorders>
+          </w:tcPr>
+          <w:p>
+            <w:pPr>
+              <w:pStyle w:val="Contenudetableau"/>
+              <w:ind w:hanging="578" w:start="578"/>
+              <w:rPr/>
+            </w:pPr>
+            <w:r>
+              <w:rPr/>
+              <w:t>Résitant</w:t>
+            </w:r>
+          </w:p>
+        </w:tc>
+      </w:tr>
+    </w:tbl>
+    <w:p>
+      <w:pPr>
+        <w:pStyle w:val="Style21"/>
+        <w:widowControl/>
+        <w:numPr>
+          <w:ilvl w:val="0"/>
+          <w:numId w:val="0"/>
+        </w:numPr>
+        <w:suppressAutoHyphens w:val="true"/>
+        <w:spacing w:lineRule="auto" w:line="259"/>
+        <w:ind w:hanging="578" w:start="578"/>
+        <w:jc w:val="start"/>
+        <w:rPr/>
+      </w:pPr>
+      <w:r>
+        <w:rPr/>
+      </w:r>
+    </w:p>
+    <w:p>
+      <w:pPr>
+        <w:pStyle w:val="Style21"/>
+        <w:numPr>
+          <w:ilvl w:val="1"/>
+          <w:numId w:val="1"/>
+        </w:numPr>
+        <w:ind w:hanging="578" w:start="578"/>
+        <w:rPr/>
+      </w:pPr>
+      <w:r>
+        <w:rPr/>
         <w:t>Branchements</w:t>
       </w:r>
     </w:p>
     <w:p>
       <w:pPr>
         <w:pStyle w:val="Normal"/>
-        <w:ind w:start="360"/>
+        <w:ind w:hanging="0" w:start="0"/>
         <w:rPr/>
       </w:pPr>
       <w:r>
@@ -5519,605 +5813,17 @@
       </w:pPr>
       <w:r>
         <w:rPr/>
-        <w:t>Recherche</w:t>
-      </w:r>
-      <w:r>
-        <w:rPr/>
-        <w:t>z</w:t>
-      </w:r>
-      <w:r>
-        <w:rPr/>
-        <w:t xml:space="preserve"> une image sur le Web de chacun des différents connecteurs qu'il est utile de connaître et ajouter l'image au tableau ci-dessous:</w:t>
+        <w:t>Nommez ceux qui sont sur votre ordinateur (par exemple, USB-C, HDMI, USB-A, …).</w:t>
       </w:r>
     </w:p>
-    <w:tbl>
-      <w:tblPr>
-        <w:tblStyle w:val="Grilledutableau"/>
-        <w:tblW w:w="8656" w:type="dxa"/>
-        <w:jc w:val="start"/>
-        <w:tblInd w:w="360" w:type="dxa"/>
-        <w:tblLayout w:type="fixed"/>
-        <w:tblCellMar>
-          <w:top w:w="0" w:type="dxa"/>
-          <w:start w:w="108" w:type="dxa"/>
-          <w:bottom w:w="0" w:type="dxa"/>
-          <w:end w:w="108" w:type="dxa"/>
-        </w:tblCellMar>
-        <w:tblLook w:firstRow="1" w:noVBand="1" w:lastRow="0" w:firstColumn="1" w:lastColumn="0" w:noHBand="0" w:val="04a0"/>
-      </w:tblPr>
-      <w:tblGrid>
-        <w:gridCol w:w="4328"/>
-        <w:gridCol w:w="4328"/>
-      </w:tblGrid>
-      <w:tr>
-        <w:trPr/>
-        <w:tc>
-          <w:tcPr>
-            <w:tcW w:w="4328" w:type="dxa"/>
-            <w:tcBorders/>
-          </w:tcPr>
-          <w:p>
-            <w:pPr>
-              <w:pStyle w:val="Normal"/>
-              <w:widowControl/>
-              <w:spacing w:lineRule="auto" w:line="240" w:before="0" w:after="0"/>
-              <w:jc w:val="start"/>
-              <w:rPr>
-                <w:rFonts w:ascii="Calibri" w:hAnsi="Calibri" w:eastAsia="Calibri" w:cs="Arial"/>
-                <w:kern w:val="0"/>
-                <w:sz w:val="22"/>
-                <w:szCs w:val="22"/>
-                <w:lang w:val="fr-CH" w:eastAsia="en-US" w:bidi="ar-SA"/>
-              </w:rPr>
-            </w:pPr>
-            <w:r>
-              <w:rPr>
-                <w:rFonts w:eastAsia="Calibri" w:cs="Arial"/>
-                <w:kern w:val="0"/>
-                <w:sz w:val="22"/>
-                <w:szCs w:val="22"/>
-                <w:lang w:val="fr-CH" w:eastAsia="en-US" w:bidi="ar-SA"/>
-              </w:rPr>
-              <w:t>USB Type-A:</w:t>
-            </w:r>
-          </w:p>
-          <w:p>
-            <w:pPr>
-              <w:pStyle w:val="Normal"/>
-              <w:widowControl/>
-              <w:spacing w:lineRule="auto" w:line="240" w:before="0" w:after="0"/>
-              <w:jc w:val="start"/>
-              <w:rPr>
-                <w:b/>
-                <w:bCs/>
-              </w:rPr>
-            </w:pPr>
-            <w:r>
-              <w:rPr>
-                <w:rFonts w:eastAsia="Calibri" w:cs="Arial"/>
-                <w:kern w:val="0"/>
-                <w:sz w:val="22"/>
-                <w:szCs w:val="22"/>
-                <w:lang w:val="fr-CH" w:eastAsia="en-US" w:bidi="ar-SA"/>
-              </w:rPr>
-              <w:drawing>
-                <wp:inline distT="0" distB="0" distL="0" distR="0">
-                  <wp:extent cx="469900" cy="279400"/>
-                  <wp:effectExtent l="0" t="0" r="0" b="0"/>
-                  <wp:docPr id="34" name="Image 6"/>
-                  <wp:cNvGraphicFramePr>
-                    <a:graphicFrameLocks xmlns:a="http://schemas.openxmlformats.org/drawingml/2006/main" noChangeAspect="1"/>
-                  </wp:cNvGraphicFramePr>
-                  <a:graphic xmlns:a="http://schemas.openxmlformats.org/drawingml/2006/main">
-                    <a:graphicData uri="http://schemas.openxmlformats.org/drawingml/2006/picture">
-                      <pic:pic xmlns:pic="http://schemas.openxmlformats.org/drawingml/2006/picture">
-                        <pic:nvPicPr>
-                          <pic:cNvPr id="34" name="Image 6"/>
-                          <pic:cNvPicPr>
-                            <a:picLocks noChangeAspect="1" noChangeArrowheads="1"/>
-                          </pic:cNvPicPr>
-                        </pic:nvPicPr>
-                        <pic:blipFill>
-                          <a:blip r:embed="rId19"/>
-                          <a:stretch>
-                            <a:fillRect/>
-                          </a:stretch>
-                        </pic:blipFill>
-                        <pic:spPr bwMode="auto">
-                          <a:xfrm>
-                            <a:off x="0" y="0"/>
-                            <a:ext cx="469900" cy="279400"/>
-                          </a:xfrm>
-                          <a:prstGeom prst="rect">
-                            <a:avLst/>
-                          </a:prstGeom>
-                          <a:noFill/>
-                        </pic:spPr>
-                      </pic:pic>
-                    </a:graphicData>
-                  </a:graphic>
-                </wp:inline>
-              </w:drawing>
-            </w:r>
-          </w:p>
-        </w:tc>
-        <w:tc>
-          <w:tcPr>
-            <w:tcW w:w="4328" w:type="dxa"/>
-            <w:tcBorders/>
-          </w:tcPr>
-          <w:p>
-            <w:pPr>
-              <w:pStyle w:val="Normal"/>
-              <w:widowControl/>
-              <w:spacing w:lineRule="auto" w:line="240" w:before="0" w:after="0"/>
-              <w:jc w:val="start"/>
-              <w:rPr>
-                <w:rFonts w:ascii="Calibri" w:hAnsi="Calibri" w:eastAsia="Calibri" w:cs="Arial"/>
-                <w:kern w:val="0"/>
-                <w:sz w:val="22"/>
-                <w:szCs w:val="22"/>
-                <w:lang w:val="fr-CH" w:eastAsia="en-US" w:bidi="ar-SA"/>
-              </w:rPr>
-            </w:pPr>
-            <w:r>
-              <w:rPr>
-                <w:rFonts w:eastAsia="Calibri" w:cs="Arial"/>
-                <w:kern w:val="0"/>
-                <w:sz w:val="22"/>
-                <w:szCs w:val="22"/>
-                <w:lang w:val="fr-CH" w:eastAsia="en-US" w:bidi="ar-SA"/>
-              </w:rPr>
-              <w:t>USB Micro-B:</w:t>
-            </w:r>
-          </w:p>
-          <w:p>
-            <w:pPr>
-              <w:pStyle w:val="Normal"/>
-              <w:widowControl/>
-              <w:spacing w:lineRule="auto" w:line="240" w:before="0" w:after="0"/>
-              <w:jc w:val="start"/>
-              <w:rPr>
-                <w:rFonts w:ascii="Calibri" w:hAnsi="Calibri" w:eastAsia="Calibri" w:cs="Arial"/>
-                <w:kern w:val="0"/>
-                <w:sz w:val="22"/>
-                <w:szCs w:val="22"/>
-                <w:lang w:val="fr-CH" w:eastAsia="en-US" w:bidi="ar-SA"/>
-              </w:rPr>
-            </w:pPr>
-            <w:r>
-              <w:rPr>
-                <w:rFonts w:eastAsia="Calibri" w:cs="Arial"/>
-                <w:kern w:val="0"/>
-                <w:sz w:val="22"/>
-                <w:szCs w:val="22"/>
-                <w:lang w:val="fr-CH" w:eastAsia="en-US" w:bidi="ar-SA"/>
-              </w:rPr>
-              <w:drawing>
-                <wp:inline distT="0" distB="0" distL="0" distR="0">
-                  <wp:extent cx="387350" cy="279400"/>
-                  <wp:effectExtent l="0" t="0" r="0" b="0"/>
-                  <wp:docPr id="35" name="Image 7"/>
-                  <wp:cNvGraphicFramePr>
-                    <a:graphicFrameLocks xmlns:a="http://schemas.openxmlformats.org/drawingml/2006/main" noChangeAspect="1"/>
-                  </wp:cNvGraphicFramePr>
-                  <a:graphic xmlns:a="http://schemas.openxmlformats.org/drawingml/2006/main">
-                    <a:graphicData uri="http://schemas.openxmlformats.org/drawingml/2006/picture">
-                      <pic:pic xmlns:pic="http://schemas.openxmlformats.org/drawingml/2006/picture">
-                        <pic:nvPicPr>
-                          <pic:cNvPr id="35" name="Image 7"/>
-                          <pic:cNvPicPr>
-                            <a:picLocks noChangeAspect="1" noChangeArrowheads="1"/>
-                          </pic:cNvPicPr>
-                        </pic:nvPicPr>
-                        <pic:blipFill>
-                          <a:blip r:embed="rId20"/>
-                          <a:stretch>
-                            <a:fillRect/>
-                          </a:stretch>
-                        </pic:blipFill>
-                        <pic:spPr bwMode="auto">
-                          <a:xfrm>
-                            <a:off x="0" y="0"/>
-                            <a:ext cx="387350" cy="279400"/>
-                          </a:xfrm>
-                          <a:prstGeom prst="rect">
-                            <a:avLst/>
-                          </a:prstGeom>
-                          <a:noFill/>
-                        </pic:spPr>
-                      </pic:pic>
-                    </a:graphicData>
-                  </a:graphic>
-                </wp:inline>
-              </w:drawing>
-            </w:r>
-          </w:p>
-        </w:tc>
-      </w:tr>
-      <w:tr>
-        <w:trPr/>
-        <w:tc>
-          <w:tcPr>
-            <w:tcW w:w="4328" w:type="dxa"/>
-            <w:tcBorders/>
-          </w:tcPr>
-          <w:p>
-            <w:pPr>
-              <w:pStyle w:val="Normal"/>
-              <w:widowControl/>
-              <w:spacing w:lineRule="auto" w:line="240" w:before="0" w:after="0"/>
-              <w:jc w:val="start"/>
-              <w:rPr>
-                <w:rFonts w:ascii="Calibri" w:hAnsi="Calibri" w:eastAsia="Calibri" w:cs="Arial"/>
-                <w:kern w:val="0"/>
-                <w:sz w:val="22"/>
-                <w:szCs w:val="22"/>
-                <w:lang w:val="fr-CH" w:eastAsia="en-US" w:bidi="ar-SA"/>
-              </w:rPr>
-            </w:pPr>
-            <w:r>
-              <w:rPr>
-                <w:rFonts w:eastAsia="Calibri" w:cs="Arial"/>
-                <w:kern w:val="0"/>
-                <w:sz w:val="22"/>
-                <w:szCs w:val="22"/>
-                <w:lang w:val="fr-CH" w:eastAsia="en-US" w:bidi="ar-SA"/>
-              </w:rPr>
-              <w:t>USB C:</w:t>
-            </w:r>
-          </w:p>
-          <w:p>
-            <w:pPr>
-              <w:pStyle w:val="Normal"/>
-              <w:widowControl/>
-              <w:spacing w:lineRule="auto" w:line="240" w:before="0" w:after="0"/>
-              <w:jc w:val="start"/>
-              <w:rPr>
-                <w:rFonts w:ascii="Calibri" w:hAnsi="Calibri" w:eastAsia="Calibri" w:cs="Arial"/>
-                <w:kern w:val="0"/>
-                <w:sz w:val="22"/>
-                <w:szCs w:val="22"/>
-                <w:lang w:val="fr-CH" w:eastAsia="en-US" w:bidi="ar-SA"/>
-              </w:rPr>
-            </w:pPr>
-            <w:r>
-              <w:rPr>
-                <w:rFonts w:eastAsia="Calibri" w:cs="Arial"/>
-                <w:kern w:val="0"/>
-                <w:sz w:val="22"/>
-                <w:szCs w:val="22"/>
-                <w:lang w:val="fr-CH" w:eastAsia="en-US" w:bidi="ar-SA"/>
-              </w:rPr>
-              <w:drawing>
-                <wp:inline distT="0" distB="0" distL="0" distR="0">
-                  <wp:extent cx="342900" cy="222250"/>
-                  <wp:effectExtent l="0" t="0" r="0" b="0"/>
-                  <wp:docPr id="36" name="Image18"/>
-                  <wp:cNvGraphicFramePr>
-                    <a:graphicFrameLocks xmlns:a="http://schemas.openxmlformats.org/drawingml/2006/main" noChangeAspect="1"/>
-                  </wp:cNvGraphicFramePr>
-                  <a:graphic xmlns:a="http://schemas.openxmlformats.org/drawingml/2006/main">
-                    <a:graphicData uri="http://schemas.openxmlformats.org/drawingml/2006/picture">
-                      <pic:pic xmlns:pic="http://schemas.openxmlformats.org/drawingml/2006/picture">
-                        <pic:nvPicPr>
-                          <pic:cNvPr id="36" name="Image18"/>
-                          <pic:cNvPicPr>
-                            <a:picLocks noChangeAspect="1" noChangeArrowheads="1"/>
-                          </pic:cNvPicPr>
-                        </pic:nvPicPr>
-                        <pic:blipFill>
-                          <a:blip r:embed="rId21"/>
-                          <a:stretch>
-                            <a:fillRect/>
-                          </a:stretch>
-                        </pic:blipFill>
-                        <pic:spPr bwMode="auto">
-                          <a:xfrm>
-                            <a:off x="0" y="0"/>
-                            <a:ext cx="342900" cy="222250"/>
-                          </a:xfrm>
-                          <a:prstGeom prst="rect">
-                            <a:avLst/>
-                          </a:prstGeom>
-                          <a:noFill/>
-                        </pic:spPr>
-                      </pic:pic>
-                    </a:graphicData>
-                  </a:graphic>
-                </wp:inline>
-              </w:drawing>
-            </w:r>
-          </w:p>
-        </w:tc>
-        <w:tc>
-          <w:tcPr>
-            <w:tcW w:w="4328" w:type="dxa"/>
-            <w:tcBorders/>
-          </w:tcPr>
-          <w:p>
-            <w:pPr>
-              <w:pStyle w:val="Normal"/>
-              <w:widowControl/>
-              <w:spacing w:lineRule="auto" w:line="240" w:before="0" w:after="0"/>
-              <w:jc w:val="start"/>
-              <w:rPr>
-                <w:rFonts w:ascii="Calibri" w:hAnsi="Calibri" w:eastAsia="Calibri" w:cs="Arial"/>
-                <w:kern w:val="0"/>
-                <w:sz w:val="22"/>
-                <w:szCs w:val="22"/>
-                <w:lang w:val="fr-CH" w:eastAsia="en-US" w:bidi="ar-SA"/>
-              </w:rPr>
-            </w:pPr>
-            <w:r>
-              <w:rPr>
-                <w:rFonts w:eastAsia="Calibri" w:cs="Arial"/>
-                <w:kern w:val="0"/>
-                <w:sz w:val="22"/>
-                <w:szCs w:val="22"/>
-                <w:lang w:val="fr-CH" w:eastAsia="en-US" w:bidi="ar-SA"/>
-              </w:rPr>
-              <w:t xml:space="preserve">HDMI: </w:t>
-            </w:r>
-          </w:p>
-          <w:p>
-            <w:pPr>
-              <w:pStyle w:val="Normal"/>
-              <w:widowControl/>
-              <w:spacing w:lineRule="auto" w:line="240" w:before="0" w:after="0"/>
-              <w:jc w:val="start"/>
-              <w:rPr>
-                <w:rFonts w:ascii="Calibri" w:hAnsi="Calibri" w:eastAsia="Calibri" w:cs="Arial"/>
-                <w:kern w:val="0"/>
-                <w:sz w:val="22"/>
-                <w:szCs w:val="22"/>
-                <w:lang w:val="fr-CH" w:eastAsia="en-US" w:bidi="ar-SA"/>
-              </w:rPr>
-            </w:pPr>
-            <w:r>
-              <w:rPr>
-                <w:rFonts w:eastAsia="Calibri" w:cs="Arial"/>
-                <w:kern w:val="0"/>
-                <w:sz w:val="22"/>
-                <w:szCs w:val="22"/>
-                <w:lang w:val="fr-CH" w:eastAsia="en-US" w:bidi="ar-SA"/>
-              </w:rPr>
-              <w:drawing>
-                <wp:inline distT="0" distB="0" distL="0" distR="0">
-                  <wp:extent cx="438150" cy="234950"/>
-                  <wp:effectExtent l="0" t="0" r="0" b="0"/>
-                  <wp:docPr id="37" name="Image19"/>
-                  <wp:cNvGraphicFramePr>
-                    <a:graphicFrameLocks xmlns:a="http://schemas.openxmlformats.org/drawingml/2006/main" noChangeAspect="1"/>
-                  </wp:cNvGraphicFramePr>
-                  <a:graphic xmlns:a="http://schemas.openxmlformats.org/drawingml/2006/main">
-                    <a:graphicData uri="http://schemas.openxmlformats.org/drawingml/2006/picture">
-                      <pic:pic xmlns:pic="http://schemas.openxmlformats.org/drawingml/2006/picture">
-                        <pic:nvPicPr>
-                          <pic:cNvPr id="37" name="Image19"/>
-                          <pic:cNvPicPr>
-                            <a:picLocks noChangeAspect="1" noChangeArrowheads="1"/>
-                          </pic:cNvPicPr>
-                        </pic:nvPicPr>
-                        <pic:blipFill>
-                          <a:blip r:embed="rId22"/>
-                          <a:stretch>
-                            <a:fillRect/>
-                          </a:stretch>
-                        </pic:blipFill>
-                        <pic:spPr bwMode="auto">
-                          <a:xfrm>
-                            <a:off x="0" y="0"/>
-                            <a:ext cx="438150" cy="234950"/>
-                          </a:xfrm>
-                          <a:prstGeom prst="rect">
-                            <a:avLst/>
-                          </a:prstGeom>
-                          <a:noFill/>
-                        </pic:spPr>
-                      </pic:pic>
-                    </a:graphicData>
-                  </a:graphic>
-                </wp:inline>
-              </w:drawing>
-            </w:r>
-          </w:p>
-        </w:tc>
-      </w:tr>
-      <w:tr>
-        <w:trPr/>
-        <w:tc>
-          <w:tcPr>
-            <w:tcW w:w="4328" w:type="dxa"/>
-            <w:tcBorders/>
-          </w:tcPr>
-          <w:p>
-            <w:pPr>
-              <w:pStyle w:val="Normal"/>
-              <w:widowControl/>
-              <w:spacing w:lineRule="auto" w:line="240" w:before="0" w:after="0"/>
-              <w:jc w:val="start"/>
-              <w:rPr>
-                <w:rFonts w:ascii="Calibri" w:hAnsi="Calibri" w:eastAsia="Calibri" w:cs="Arial"/>
-                <w:kern w:val="0"/>
-                <w:sz w:val="22"/>
-                <w:szCs w:val="22"/>
-                <w:lang w:val="fr-CH" w:eastAsia="en-US" w:bidi="ar-SA"/>
-              </w:rPr>
-            </w:pPr>
-            <w:r>
-              <w:rPr>
-                <w:rFonts w:eastAsia="Calibri" w:cs="Arial"/>
-                <w:kern w:val="0"/>
-                <w:sz w:val="22"/>
-                <w:szCs w:val="22"/>
-                <w:lang w:val="fr-CH" w:eastAsia="en-US" w:bidi="ar-SA"/>
-              </w:rPr>
-              <w:t>Câble réseau:</w:t>
-            </w:r>
-          </w:p>
-          <w:p>
-            <w:pPr>
-              <w:pStyle w:val="Normal"/>
-              <w:widowControl/>
-              <w:spacing w:lineRule="auto" w:line="240" w:before="0" w:after="0"/>
-              <w:jc w:val="start"/>
-              <w:rPr>
-                <w:rFonts w:ascii="Calibri" w:hAnsi="Calibri" w:eastAsia="Calibri" w:cs="Arial"/>
-                <w:kern w:val="0"/>
-                <w:sz w:val="22"/>
-                <w:szCs w:val="22"/>
-                <w:lang w:val="fr-CH" w:eastAsia="en-US" w:bidi="ar-SA"/>
-              </w:rPr>
-            </w:pPr>
-            <w:r>
-              <w:rPr>
-                <w:rFonts w:eastAsia="Calibri" w:cs="Arial"/>
-                <w:kern w:val="0"/>
-                <w:sz w:val="22"/>
-                <w:szCs w:val="22"/>
-                <w:lang w:val="fr-CH" w:eastAsia="en-US" w:bidi="ar-SA"/>
-              </w:rPr>
-              <w:drawing>
-                <wp:inline distT="0" distB="0" distL="0" distR="0">
-                  <wp:extent cx="304800" cy="228600"/>
-                  <wp:effectExtent l="0" t="0" r="0" b="0"/>
-                  <wp:docPr id="38" name="Image 10"/>
-                  <wp:cNvGraphicFramePr>
-                    <a:graphicFrameLocks xmlns:a="http://schemas.openxmlformats.org/drawingml/2006/main" noChangeAspect="1"/>
-                  </wp:cNvGraphicFramePr>
-                  <a:graphic xmlns:a="http://schemas.openxmlformats.org/drawingml/2006/main">
-                    <a:graphicData uri="http://schemas.openxmlformats.org/drawingml/2006/picture">
-                      <pic:pic xmlns:pic="http://schemas.openxmlformats.org/drawingml/2006/picture">
-                        <pic:nvPicPr>
-                          <pic:cNvPr id="38" name="Image 10"/>
-                          <pic:cNvPicPr>
-                            <a:picLocks noChangeAspect="1" noChangeArrowheads="1"/>
-                          </pic:cNvPicPr>
-                        </pic:nvPicPr>
-                        <pic:blipFill>
-                          <a:blip r:embed="rId23"/>
-                          <a:stretch>
-                            <a:fillRect/>
-                          </a:stretch>
-                        </pic:blipFill>
-                        <pic:spPr bwMode="auto">
-                          <a:xfrm>
-                            <a:off x="0" y="0"/>
-                            <a:ext cx="304800" cy="228600"/>
-                          </a:xfrm>
-                          <a:prstGeom prst="rect">
-                            <a:avLst/>
-                          </a:prstGeom>
-                          <a:noFill/>
-                        </pic:spPr>
-                      </pic:pic>
-                    </a:graphicData>
-                  </a:graphic>
-                </wp:inline>
-              </w:drawing>
-            </w:r>
-          </w:p>
-        </w:tc>
-        <w:tc>
-          <w:tcPr>
-            <w:tcW w:w="4328" w:type="dxa"/>
-            <w:tcBorders/>
-          </w:tcPr>
-          <w:p>
-            <w:pPr>
-              <w:pStyle w:val="Normal"/>
-              <w:widowControl/>
-              <w:spacing w:lineRule="auto" w:line="240" w:before="0" w:after="0"/>
-              <w:jc w:val="start"/>
-              <w:rPr>
-                <w:rFonts w:ascii="Calibri" w:hAnsi="Calibri" w:eastAsia="Calibri" w:cs="Arial"/>
-                <w:kern w:val="0"/>
-                <w:sz w:val="22"/>
-                <w:szCs w:val="22"/>
-                <w:lang w:val="fr-CH" w:eastAsia="en-US" w:bidi="ar-SA"/>
-              </w:rPr>
-            </w:pPr>
-            <w:r>
-              <w:rPr>
-                <w:rFonts w:eastAsia="Calibri" w:cs="Arial"/>
-                <w:kern w:val="0"/>
-                <w:sz w:val="22"/>
-                <w:szCs w:val="22"/>
-                <w:lang w:val="fr-CH" w:eastAsia="en-US" w:bidi="ar-SA"/>
-              </w:rPr>
-              <w:t>Pour casque ou haut-parleur:</w:t>
-            </w:r>
-          </w:p>
-          <w:p>
-            <w:pPr>
-              <w:pStyle w:val="Normal"/>
-              <w:widowControl/>
-              <w:spacing w:lineRule="auto" w:line="240" w:before="0" w:after="0"/>
-              <w:jc w:val="start"/>
-              <w:rPr>
-                <w:rFonts w:ascii="Calibri" w:hAnsi="Calibri" w:eastAsia="Calibri" w:cs="Arial"/>
-                <w:kern w:val="0"/>
-                <w:sz w:val="22"/>
-                <w:szCs w:val="22"/>
-                <w:lang w:val="fr-CH" w:eastAsia="en-US" w:bidi="ar-SA"/>
-              </w:rPr>
-            </w:pPr>
-            <w:r>
-              <w:rPr>
-                <w:rFonts w:eastAsia="Calibri" w:cs="Arial"/>
-                <w:kern w:val="0"/>
-                <w:sz w:val="22"/>
-                <w:szCs w:val="22"/>
-                <w:lang w:val="fr-CH" w:eastAsia="en-US" w:bidi="ar-SA"/>
-              </w:rPr>
-              <w:drawing>
-                <wp:inline distT="0" distB="0" distL="0" distR="0">
-                  <wp:extent cx="381000" cy="266700"/>
-                  <wp:effectExtent l="0" t="0" r="0" b="0"/>
-                  <wp:docPr id="39" name="Image20"/>
-                  <wp:cNvGraphicFramePr>
-                    <a:graphicFrameLocks xmlns:a="http://schemas.openxmlformats.org/drawingml/2006/main" noChangeAspect="1"/>
-                  </wp:cNvGraphicFramePr>
-                  <a:graphic xmlns:a="http://schemas.openxmlformats.org/drawingml/2006/main">
-                    <a:graphicData uri="http://schemas.openxmlformats.org/drawingml/2006/picture">
-                      <pic:pic xmlns:pic="http://schemas.openxmlformats.org/drawingml/2006/picture">
-                        <pic:nvPicPr>
-                          <pic:cNvPr id="39" name="Image20"/>
-                          <pic:cNvPicPr>
-                            <a:picLocks noChangeAspect="1" noChangeArrowheads="1"/>
-                          </pic:cNvPicPr>
-                        </pic:nvPicPr>
-                        <pic:blipFill>
-                          <a:blip r:embed="rId24"/>
-                          <a:stretch>
-                            <a:fillRect/>
-                          </a:stretch>
-                        </pic:blipFill>
-                        <pic:spPr bwMode="auto">
-                          <a:xfrm>
-                            <a:off x="0" y="0"/>
-                            <a:ext cx="381000" cy="266700"/>
-                          </a:xfrm>
-                          <a:prstGeom prst="rect">
-                            <a:avLst/>
-                          </a:prstGeom>
-                          <a:noFill/>
-                        </pic:spPr>
-                      </pic:pic>
-                    </a:graphicData>
-                  </a:graphic>
-                </wp:inline>
-              </w:drawing>
-            </w:r>
-          </w:p>
-        </w:tc>
-      </w:tr>
-    </w:tbl>
     <w:p>
       <w:pPr>
-        <w:pStyle w:val="Normal"/>
-        <w:ind w:start="360"/>
+        <w:pStyle w:val="ListParagraph"/>
+        <w:numPr>
+          <w:ilvl w:val="0"/>
+          <w:numId w:val="0"/>
+        </w:numPr>
+        <w:ind w:hanging="0" w:start="720"/>
         <w:rPr/>
       </w:pPr>
       <w:r>
@@ -6150,15 +5856,7 @@
       </w:pPr>
       <w:r>
         <w:rPr/>
-        <w:t>Pourquoi y a-t-il un dissipateur thermique et un ventilateur au-dessus d</w:t>
-      </w:r>
-      <w:r>
-        <w:rPr/>
-        <w:t>u</w:t>
-      </w:r>
-      <w:r>
-        <w:rPr/>
-        <w:t xml:space="preserve"> processeur?</w:t>
+        <w:t>Pourquoi y a-t-il un dissipateur thermique et un ventilateur au-dessus du processeur?</w:t>
       </w:r>
     </w:p>
     <w:p>
@@ -6224,15 +5922,7 @@
       </w:pPr>
       <w:r>
         <w:rPr/>
-        <w:t xml:space="preserve">Pourquoi le BIOS a-t-il besoin de la batterie </w:t>
-      </w:r>
-      <w:r>
-        <w:rPr/>
-        <w:t>(ou pile)</w:t>
-      </w:r>
-      <w:r>
-        <w:rPr/>
-        <w:t>?</w:t>
+        <w:t>Pourquoi le BIOS a-t-il besoin de la batterie (ou pile)?</w:t>
       </w:r>
     </w:p>
     <w:p>
@@ -6298,15 +5988,7 @@
       </w:pPr>
       <w:r>
         <w:rPr/>
-        <w:t>Cite</w:t>
-      </w:r>
-      <w:r>
-        <w:rPr/>
-        <w:t>z</w:t>
-      </w:r>
-      <w:r>
-        <w:rPr/>
-        <w:t xml:space="preserve"> les supports qu'il existe pour sauvegarder des données.</w:t>
+        <w:t>Citez les supports qu'il existe pour sauvegarder des données.</w:t>
       </w:r>
     </w:p>
     <w:p>
@@ -6329,12 +6011,12 @@
       </w:r>
     </w:p>
     <w:sectPr>
-      <w:headerReference w:type="even" r:id="rId25"/>
-      <w:headerReference w:type="default" r:id="rId26"/>
-      <w:headerReference w:type="first" r:id="rId27"/>
-      <w:footerReference w:type="even" r:id="rId28"/>
-      <w:footerReference w:type="default" r:id="rId29"/>
-      <w:footerReference w:type="first" r:id="rId30"/>
+      <w:headerReference w:type="even" r:id="rId19"/>
+      <w:headerReference w:type="default" r:id="rId20"/>
+      <w:headerReference w:type="first" r:id="rId21"/>
+      <w:footerReference w:type="even" r:id="rId22"/>
+      <w:footerReference w:type="default" r:id="rId23"/>
+      <w:footerReference w:type="first" r:id="rId24"/>
       <w:type w:val="nextPage"/>
       <w:pgSz w:w="11906" w:h="16838"/>
       <w:pgMar w:left="1440" w:right="1440" w:gutter="0" w:header="708" w:top="1440" w:footer="708" w:bottom="1440"/>
@@ -7285,6 +6967,143 @@
   <w:abstractNum w:abstractNumId="7">
     <w:lvl w:ilvl="0">
       <w:start w:val="1"/>
+      <w:numFmt w:val="bullet"/>
+      <w:lvlText w:val=""/>
+      <w:lvlJc w:val="start"/>
+      <w:pPr>
+        <w:tabs>
+          <w:tab w:val="num" w:pos="720"/>
+        </w:tabs>
+        <w:ind w:start="720" w:hanging="360"/>
+      </w:pPr>
+      <w:rPr>
+        <w:rFonts w:ascii="Symbol" w:hAnsi="Symbol" w:cs="Symbol" w:hint="default"/>
+      </w:rPr>
+    </w:lvl>
+    <w:lvl w:ilvl="1">
+      <w:start w:val="1"/>
+      <w:numFmt w:val="bullet"/>
+      <w:lvlText w:val="◦"/>
+      <w:lvlJc w:val="start"/>
+      <w:pPr>
+        <w:tabs>
+          <w:tab w:val="num" w:pos="1080"/>
+        </w:tabs>
+        <w:ind w:start="1080" w:hanging="360"/>
+      </w:pPr>
+      <w:rPr>
+        <w:rFonts w:ascii="OpenSymbol" w:hAnsi="OpenSymbol" w:cs="OpenSymbol" w:hint="default"/>
+      </w:rPr>
+    </w:lvl>
+    <w:lvl w:ilvl="2">
+      <w:start w:val="1"/>
+      <w:numFmt w:val="bullet"/>
+      <w:lvlText w:val="▪"/>
+      <w:lvlJc w:val="start"/>
+      <w:pPr>
+        <w:tabs>
+          <w:tab w:val="num" w:pos="1440"/>
+        </w:tabs>
+        <w:ind w:start="1440" w:hanging="360"/>
+      </w:pPr>
+      <w:rPr>
+        <w:rFonts w:ascii="OpenSymbol" w:hAnsi="OpenSymbol" w:cs="OpenSymbol" w:hint="default"/>
+      </w:rPr>
+    </w:lvl>
+    <w:lvl w:ilvl="3">
+      <w:start w:val="1"/>
+      <w:numFmt w:val="bullet"/>
+      <w:lvlText w:val=""/>
+      <w:lvlJc w:val="start"/>
+      <w:pPr>
+        <w:tabs>
+          <w:tab w:val="num" w:pos="1800"/>
+        </w:tabs>
+        <w:ind w:start="1800" w:hanging="360"/>
+      </w:pPr>
+      <w:rPr>
+        <w:rFonts w:ascii="Symbol" w:hAnsi="Symbol" w:cs="Symbol" w:hint="default"/>
+      </w:rPr>
+    </w:lvl>
+    <w:lvl w:ilvl="4">
+      <w:start w:val="1"/>
+      <w:numFmt w:val="bullet"/>
+      <w:lvlText w:val="◦"/>
+      <w:lvlJc w:val="start"/>
+      <w:pPr>
+        <w:tabs>
+          <w:tab w:val="num" w:pos="2160"/>
+        </w:tabs>
+        <w:ind w:start="2160" w:hanging="360"/>
+      </w:pPr>
+      <w:rPr>
+        <w:rFonts w:ascii="OpenSymbol" w:hAnsi="OpenSymbol" w:cs="OpenSymbol" w:hint="default"/>
+      </w:rPr>
+    </w:lvl>
+    <w:lvl w:ilvl="5">
+      <w:start w:val="1"/>
+      <w:numFmt w:val="bullet"/>
+      <w:lvlText w:val="▪"/>
+      <w:lvlJc w:val="start"/>
+      <w:pPr>
+        <w:tabs>
+          <w:tab w:val="num" w:pos="2520"/>
+        </w:tabs>
+        <w:ind w:start="2520" w:hanging="360"/>
+      </w:pPr>
+      <w:rPr>
+        <w:rFonts w:ascii="OpenSymbol" w:hAnsi="OpenSymbol" w:cs="OpenSymbol" w:hint="default"/>
+      </w:rPr>
+    </w:lvl>
+    <w:lvl w:ilvl="6">
+      <w:start w:val="1"/>
+      <w:numFmt w:val="bullet"/>
+      <w:lvlText w:val=""/>
+      <w:lvlJc w:val="start"/>
+      <w:pPr>
+        <w:tabs>
+          <w:tab w:val="num" w:pos="2880"/>
+        </w:tabs>
+        <w:ind w:start="2880" w:hanging="360"/>
+      </w:pPr>
+      <w:rPr>
+        <w:rFonts w:ascii="Symbol" w:hAnsi="Symbol" w:cs="Symbol" w:hint="default"/>
+      </w:rPr>
+    </w:lvl>
+    <w:lvl w:ilvl="7">
+      <w:start w:val="1"/>
+      <w:numFmt w:val="bullet"/>
+      <w:lvlText w:val="◦"/>
+      <w:lvlJc w:val="start"/>
+      <w:pPr>
+        <w:tabs>
+          <w:tab w:val="num" w:pos="3240"/>
+        </w:tabs>
+        <w:ind w:start="3240" w:hanging="360"/>
+      </w:pPr>
+      <w:rPr>
+        <w:rFonts w:ascii="OpenSymbol" w:hAnsi="OpenSymbol" w:cs="OpenSymbol" w:hint="default"/>
+      </w:rPr>
+    </w:lvl>
+    <w:lvl w:ilvl="8">
+      <w:start w:val="1"/>
+      <w:numFmt w:val="bullet"/>
+      <w:lvlText w:val="▪"/>
+      <w:lvlJc w:val="start"/>
+      <w:pPr>
+        <w:tabs>
+          <w:tab w:val="num" w:pos="3600"/>
+        </w:tabs>
+        <w:ind w:start="3600" w:hanging="360"/>
+      </w:pPr>
+      <w:rPr>
+        <w:rFonts w:ascii="OpenSymbol" w:hAnsi="OpenSymbol" w:cs="OpenSymbol" w:hint="default"/>
+      </w:rPr>
+    </w:lvl>
+  </w:abstractNum>
+  <w:abstractNum w:abstractNumId="8">
+    <w:lvl w:ilvl="0">
+      <w:start w:val="1"/>
       <w:numFmt w:val="none"/>
       <w:suff w:val="nothing"/>
       <w:lvlText w:val=""/>
@@ -7422,6 +7241,9 @@
   <w:num w:numId="7">
     <w:abstractNumId w:val="7"/>
   </w:num>
+  <w:num w:numId="8">
+    <w:abstractNumId w:val="8"/>
+  </w:num>
 </w:numbering>
 </file>
 
@@ -7430,7 +7252,7 @@
   <w:docDefaults>
     <w:rPrDefault>
       <w:rPr>
-        <w:rFonts w:ascii="Calibri" w:hAnsi="Calibri" w:eastAsia="Calibri" w:cs="Arial" w:asciiTheme="minorHAnsi" w:cstheme="minorBidi" w:eastAsiaTheme="minorHAnsi" w:hAnsiTheme="minorHAnsi"/>
+        <w:rFonts w:ascii="Calibri" w:hAnsi="Calibri" w:eastAsia="Calibri" w:cs="" w:asciiTheme="minorHAnsi" w:cstheme="minorBidi" w:eastAsiaTheme="minorHAnsi" w:hAnsiTheme="minorHAnsi"/>
         <w:sz w:val="22"/>
         <w:szCs w:val="22"/>
         <w:lang w:val="fr-CH" w:eastAsia="en-US" w:bidi="ar-SA"/>
@@ -7826,12 +7648,13 @@
     <w:rsid w:val="008b47e9"/>
     <w:pPr>
       <w:widowControl/>
+      <w:suppressAutoHyphens w:val="true"/>
       <w:bidi w:val="0"/>
       <w:spacing w:lineRule="auto" w:line="259" w:before="0" w:after="0"/>
       <w:jc w:val="start"/>
     </w:pPr>
     <w:rPr>
-      <w:rFonts w:ascii="Calibri" w:hAnsi="Calibri" w:eastAsia="Calibri" w:cs="Arial" w:asciiTheme="minorHAnsi" w:cstheme="minorBidi" w:eastAsiaTheme="minorHAnsi" w:hAnsiTheme="minorHAnsi"/>
+      <w:rFonts w:ascii="Calibri" w:hAnsi="Calibri" w:eastAsia="Calibri" w:cs="" w:asciiTheme="minorHAnsi" w:cstheme="minorBidi" w:eastAsiaTheme="minorHAnsi" w:hAnsiTheme="minorHAnsi"/>
       <w:color w:val="auto"/>
       <w:kern w:val="0"/>
       <w:sz w:val="22"/>
@@ -7854,7 +7677,7 @@
       <w:outlineLvl w:val="0"/>
     </w:pPr>
     <w:rPr>
-      <w:rFonts w:ascii="Calibri Light" w:hAnsi="Calibri Light" w:eastAsia="" w:cs="Times New Roman" w:asciiTheme="majorHAnsi" w:cstheme="majorBidi" w:eastAsiaTheme="majorEastAsia" w:hAnsiTheme="majorHAnsi"/>
+      <w:rFonts w:ascii="Calibri Light" w:hAnsi="Calibri Light" w:eastAsia="" w:cs="" w:asciiTheme="majorHAnsi" w:cstheme="majorBidi" w:eastAsiaTheme="majorEastAsia" w:hAnsiTheme="majorHAnsi"/>
       <w:color w:themeColor="accent1" w:themeShade="bf" w:val="2F5496"/>
       <w:sz w:val="32"/>
       <w:szCs w:val="32"/>
@@ -7876,7 +7699,7 @@
       <w:outlineLvl w:val="1"/>
     </w:pPr>
     <w:rPr>
-      <w:rFonts w:ascii="Calibri Light" w:hAnsi="Calibri Light" w:eastAsia="" w:cs="Times New Roman" w:asciiTheme="majorHAnsi" w:cstheme="majorBidi" w:eastAsiaTheme="majorEastAsia" w:hAnsiTheme="majorHAnsi"/>
+      <w:rFonts w:ascii="Calibri Light" w:hAnsi="Calibri Light" w:eastAsia="" w:cs="" w:asciiTheme="majorHAnsi" w:cstheme="majorBidi" w:eastAsiaTheme="majorEastAsia" w:hAnsiTheme="majorHAnsi"/>
       <w:color w:themeColor="accent1" w:themeShade="bf" w:val="2F5496"/>
       <w:sz w:val="26"/>
       <w:szCs w:val="26"/>
@@ -7913,7 +7736,7 @@
     <w:qFormat/>
     <w:rsid w:val="00810795"/>
     <w:rPr>
-      <w:rFonts w:ascii="Calibri Light" w:hAnsi="Calibri Light" w:eastAsia="" w:cs="Times New Roman" w:asciiTheme="majorHAnsi" w:cstheme="majorBidi" w:eastAsiaTheme="majorEastAsia" w:hAnsiTheme="majorHAnsi"/>
+      <w:rFonts w:ascii="Calibri Light" w:hAnsi="Calibri Light" w:eastAsia="" w:cs="" w:asciiTheme="majorHAnsi" w:cstheme="majorBidi" w:eastAsiaTheme="majorEastAsia" w:hAnsiTheme="majorHAnsi"/>
       <w:color w:themeColor="accent1" w:themeShade="bf" w:val="2F5496"/>
       <w:sz w:val="32"/>
       <w:szCs w:val="32"/>
@@ -7938,7 +7761,7 @@
     <w:qFormat/>
     <w:rsid w:val="00810795"/>
     <w:rPr>
-      <w:rFonts w:ascii="Calibri Light" w:hAnsi="Calibri Light" w:eastAsia="" w:cs="Times New Roman" w:asciiTheme="majorHAnsi" w:cstheme="majorBidi" w:eastAsiaTheme="majorEastAsia" w:hAnsiTheme="majorHAnsi"/>
+      <w:rFonts w:ascii="Calibri Light" w:hAnsi="Calibri Light" w:eastAsia="" w:cs="" w:asciiTheme="majorHAnsi" w:cstheme="majorBidi" w:eastAsiaTheme="majorEastAsia" w:hAnsiTheme="majorHAnsi"/>
       <w:color w:themeColor="accent1" w:themeShade="bf" w:val="2F5496"/>
       <w:sz w:val="26"/>
       <w:szCs w:val="26"/>
@@ -7951,7 +7774,7 @@
     <w:qFormat/>
     <w:rsid w:val="008c0b46"/>
     <w:rPr>
-      <w:rFonts w:ascii="Calibri Light" w:hAnsi="Calibri Light" w:eastAsia="" w:cs="Times New Roman" w:asciiTheme="majorHAnsi" w:cstheme="majorBidi" w:eastAsiaTheme="majorEastAsia" w:hAnsiTheme="majorHAnsi"/>
+      <w:rFonts w:ascii="Calibri Light" w:hAnsi="Calibri Light" w:eastAsia="" w:cs="" w:asciiTheme="majorHAnsi" w:cstheme="majorBidi" w:eastAsiaTheme="majorEastAsia" w:hAnsiTheme="majorHAnsi"/>
       <w:spacing w:val="-10"/>
       <w:kern w:val="2"/>
       <w:sz w:val="56"/>
@@ -8163,6 +7986,13 @@
       <w:szCs w:val="20"/>
     </w:rPr>
   </w:style>
+  <w:style w:type="character" w:styleId="Puces">
+    <w:name w:val="Puces"/>
+    <w:qFormat/>
+    <w:rPr>
+      <w:rFonts w:ascii="OpenSymbol" w:hAnsi="OpenSymbol" w:eastAsia="OpenSymbol" w:cs="OpenSymbol"/>
+    </w:rPr>
+  </w:style>
   <w:style w:type="paragraph" w:styleId="Titre">
     <w:name w:val="Titre"/>
     <w:basedOn w:val="Normal"/>
@@ -8220,6 +8050,28 @@
     <w:rPr>
       <w:rFonts w:cs="Lucida Sans"/>
     </w:rPr>
+  </w:style>
+  <w:style w:type="paragraph" w:styleId="Titreuser">
+    <w:name w:val="Titre (user)"/>
+    <w:basedOn w:val="Normal"/>
+    <w:next w:val="BodyText"/>
+    <w:qFormat/>
+    <w:pPr>
+      <w:keepNext w:val="true"/>
+      <w:spacing w:before="240" w:after="120"/>
+    </w:pPr>
+    <w:rPr>
+      <w:rFonts w:ascii="Liberation Sans" w:hAnsi="Liberation Sans" w:eastAsia="Microsoft YaHei" w:cs="Lucida Sans"/>
+      <w:sz w:val="28"/>
+      <w:szCs w:val="28"/>
+    </w:rPr>
+  </w:style>
+  <w:style w:type="paragraph" w:styleId="En-tteetpieddepageuser">
+    <w:name w:val="En-tête et pied de page (user)"/>
+    <w:basedOn w:val="Normal"/>
+    <w:qFormat/>
+    <w:pPr/>
+    <w:rPr/>
   </w:style>
   <w:style w:type="paragraph" w:styleId="En-tteetpieddepage">
     <w:name w:val="En-tête et pied de page"/>
@@ -8284,12 +8136,13 @@
     <w:rsid w:val="00810795"/>
     <w:pPr>
       <w:widowControl/>
+      <w:suppressAutoHyphens w:val="true"/>
       <w:bidi w:val="0"/>
       <w:spacing w:lineRule="auto" w:line="240" w:before="0" w:after="0"/>
       <w:jc w:val="start"/>
     </w:pPr>
     <w:rPr>
-      <w:rFonts w:ascii="Calibri" w:hAnsi="Calibri" w:eastAsia="Calibri" w:cs="Arial" w:asciiTheme="minorHAnsi" w:cstheme="minorBidi" w:eastAsiaTheme="minorHAnsi" w:hAnsiTheme="minorHAnsi"/>
+      <w:rFonts w:ascii="Calibri" w:hAnsi="Calibri" w:eastAsia="Calibri" w:cs="" w:asciiTheme="minorHAnsi" w:cstheme="minorBidi" w:eastAsiaTheme="minorHAnsi" w:hAnsiTheme="minorHAnsi"/>
       <w:color w:val="auto"/>
       <w:kern w:val="0"/>
       <w:sz w:val="22"/>
@@ -8431,7 +8284,7 @@
       <w:contextualSpacing/>
     </w:pPr>
     <w:rPr>
-      <w:rFonts w:ascii="Calibri Light" w:hAnsi="Calibri Light" w:eastAsia="" w:cs="Times New Roman" w:asciiTheme="majorHAnsi" w:cstheme="majorBidi" w:eastAsiaTheme="majorEastAsia" w:hAnsiTheme="majorHAnsi"/>
+      <w:rFonts w:ascii="Calibri Light" w:hAnsi="Calibri Light" w:eastAsia="" w:cs="" w:asciiTheme="majorHAnsi" w:cstheme="majorBidi" w:eastAsiaTheme="majorEastAsia" w:hAnsiTheme="majorHAnsi"/>
       <w:spacing w:val="-10"/>
       <w:kern w:val="2"/>
       <w:sz w:val="56"/>
@@ -8796,6 +8649,13 @@
       <w:bCs/>
     </w:rPr>
   </w:style>
+  <w:style w:type="paragraph" w:styleId="Contenudecadreuser">
+    <w:name w:val="Contenu de cadre (user)"/>
+    <w:basedOn w:val="Normal"/>
+    <w:qFormat/>
+    <w:pPr/>
+    <w:rPr/>
+  </w:style>
   <w:style w:type="paragraph" w:styleId="Contenudecadre">
     <w:name w:val="Contenu de cadre"/>
     <w:basedOn w:val="Normal"/>
@@ -8803,8 +8663,18 @@
     <w:pPr/>
     <w:rPr/>
   </w:style>
-  <w:style w:type="numbering" w:styleId="Pasdeliste" w:default="1">
-    <w:name w:val="Pas de liste"/>
+  <w:style w:type="paragraph" w:styleId="Contenudetableau">
+    <w:name w:val="Contenu de tableau"/>
+    <w:basedOn w:val="Normal"/>
+    <w:qFormat/>
+    <w:pPr>
+      <w:widowControl w:val="false"/>
+      <w:suppressLineNumbers/>
+    </w:pPr>
+    <w:rPr/>
+  </w:style>
+  <w:style w:type="numbering" w:styleId="Pasdelisteuser" w:default="1">
+    <w:name w:val="Pas de liste (user)"/>
     <w:uiPriority w:val="99"/>
     <w:semiHidden/>
     <w:unhideWhenUsed/>

</xml_diff>